<commit_message>
finalizado el analisis del proyecto
consumo de energia analisis finalizado 100%
</commit_message>
<xml_diff>
--- a/Proyecto software de consumo de enegia.docx
+++ b/Proyecto software de consumo de enegia.docx
@@ -420,6 +420,15 @@
         </w:rPr>
         <w:t>Introducción</w:t>
       </w:r>
+      <w:r>
+        <w:rPr>
+          <w:b/>
+          <w:bCs/>
+          <w:sz w:val="36"/>
+          <w:szCs w:val="36"/>
+        </w:rPr>
+        <w:t>.</w:t>
+      </w:r>
     </w:p>
     <w:p>
       <w:pPr>
@@ -464,6 +473,15 @@
         </w:rPr>
         <w:t>n</w:t>
       </w:r>
+      <w:r>
+        <w:rPr>
+          <w:b/>
+          <w:bCs/>
+          <w:sz w:val="36"/>
+          <w:szCs w:val="36"/>
+        </w:rPr>
+        <w:t>.</w:t>
+      </w:r>
     </w:p>
     <w:p>
       <w:pPr>
@@ -499,6 +517,15 @@
         </w:rPr>
         <w:t>Definición Problema</w:t>
       </w:r>
+      <w:r>
+        <w:rPr>
+          <w:b/>
+          <w:bCs/>
+          <w:sz w:val="36"/>
+          <w:szCs w:val="36"/>
+        </w:rPr>
+        <w:t>.</w:t>
+      </w:r>
     </w:p>
     <w:p>
       <w:pPr>
@@ -534,6 +561,15 @@
         </w:rPr>
         <w:t>Reglas o condiciones</w:t>
       </w:r>
+      <w:r>
+        <w:rPr>
+          <w:b/>
+          <w:bCs/>
+          <w:sz w:val="36"/>
+          <w:szCs w:val="36"/>
+        </w:rPr>
+        <w:t>.</w:t>
+      </w:r>
     </w:p>
     <w:p>
       <w:pPr>
@@ -569,6 +605,15 @@
         </w:rPr>
         <w:t>Contexto Actual</w:t>
       </w:r>
+      <w:r>
+        <w:rPr>
+          <w:b/>
+          <w:bCs/>
+          <w:sz w:val="36"/>
+          <w:szCs w:val="36"/>
+        </w:rPr>
+        <w:t>.</w:t>
+      </w:r>
     </w:p>
     <w:p>
       <w:pPr>
@@ -602,7 +647,25 @@
           <w:sz w:val="36"/>
           <w:szCs w:val="36"/>
         </w:rPr>
-        <w:t xml:space="preserve">Objetivo General y Específico </w:t>
+        <w:t>Objetivo General y Específico</w:t>
+      </w:r>
+      <w:r>
+        <w:rPr>
+          <w:b/>
+          <w:bCs/>
+          <w:sz w:val="36"/>
+          <w:szCs w:val="36"/>
+        </w:rPr>
+        <w:t>.</w:t>
+      </w:r>
+      <w:r>
+        <w:rPr>
+          <w:b/>
+          <w:bCs/>
+          <w:sz w:val="36"/>
+          <w:szCs w:val="36"/>
+        </w:rPr>
+        <w:t xml:space="preserve"> </w:t>
       </w:r>
     </w:p>
     <w:p>
@@ -637,7 +700,34 @@
           <w:sz w:val="36"/>
           <w:szCs w:val="36"/>
         </w:rPr>
-        <w:t xml:space="preserve">Diagrama </w:t>
+        <w:t>Diagrama</w:t>
+      </w:r>
+      <w:r>
+        <w:rPr>
+          <w:b/>
+          <w:bCs/>
+          <w:sz w:val="36"/>
+          <w:szCs w:val="36"/>
+        </w:rPr>
+        <w:t>,</w:t>
+      </w:r>
+      <w:r>
+        <w:rPr>
+          <w:b/>
+          <w:bCs/>
+          <w:sz w:val="36"/>
+          <w:szCs w:val="36"/>
+        </w:rPr>
+        <w:t xml:space="preserve"> </w:t>
+      </w:r>
+      <w:r>
+        <w:rPr>
+          <w:b/>
+          <w:bCs/>
+          <w:sz w:val="36"/>
+          <w:szCs w:val="36"/>
+        </w:rPr>
+        <w:t>Flujo diagrama.</w:t>
       </w:r>
     </w:p>
     <w:p>
@@ -683,10 +773,18 @@
         </w:rPr>
         <w:t>a</w:t>
       </w:r>
-    </w:p>
-    <w:p>
-      <w:pPr>
-        <w:pStyle w:val="Prrafodelista"/>
+      <w:r>
+        <w:rPr>
+          <w:b/>
+          <w:bCs/>
+          <w:sz w:val="36"/>
+          <w:szCs w:val="36"/>
+        </w:rPr>
+        <w:t>.</w:t>
+      </w:r>
+    </w:p>
+    <w:p>
+      <w:pPr>
         <w:rPr>
           <w:b/>
           <w:bCs/>
@@ -716,42 +814,16 @@
           <w:sz w:val="36"/>
           <w:szCs w:val="36"/>
         </w:rPr>
-        <w:t>Flujo diagrama</w:t>
-      </w:r>
-    </w:p>
-    <w:p>
-      <w:pPr>
-        <w:pStyle w:val="Prrafodelista"/>
+        <w:t>Conclusión</w:t>
+      </w:r>
+      <w:r>
         <w:rPr>
           <w:b/>
           <w:bCs/>
           <w:sz w:val="36"/>
           <w:szCs w:val="36"/>
         </w:rPr>
-      </w:pPr>
-    </w:p>
-    <w:p>
-      <w:pPr>
-        <w:pStyle w:val="Prrafodelista"/>
-        <w:numPr>
-          <w:ilvl w:val="0"/>
-          <w:numId w:val="1"/>
-        </w:numPr>
-        <w:rPr>
-          <w:b/>
-          <w:bCs/>
-          <w:sz w:val="36"/>
-          <w:szCs w:val="36"/>
-        </w:rPr>
-      </w:pPr>
-      <w:r>
-        <w:rPr>
-          <w:b/>
-          <w:bCs/>
-          <w:sz w:val="36"/>
-          <w:szCs w:val="36"/>
-        </w:rPr>
-        <w:t>Conclusión</w:t>
+        <w:t>.</w:t>
       </w:r>
     </w:p>
     <w:p>
@@ -787,7 +859,10 @@
           <w:szCs w:val="40"/>
         </w:rPr>
       </w:pPr>
-      <w:r>
+    </w:p>
+    <w:p>
+      <w:pPr>
+        <w:jc w:val="center"/>
         <w:rPr>
           <w:rFonts w:ascii="Algerian" w:hAnsi="Algerian"/>
           <w:b/>
@@ -795,18 +870,27 @@
           <w:sz w:val="40"/>
           <w:szCs w:val="40"/>
         </w:rPr>
-        <w:t xml:space="preserve">Introducción </w:t>
-      </w:r>
-    </w:p>
-    <w:p>
-      <w:pPr>
-        <w:jc w:val="center"/>
-        <w:rPr>
+      </w:pPr>
+      <w:r>
+        <w:rPr>
+          <w:rFonts w:ascii="Algerian" w:hAnsi="Algerian"/>
           <w:b/>
           <w:bCs/>
           <w:sz w:val="40"/>
           <w:szCs w:val="40"/>
         </w:rPr>
+        <w:t xml:space="preserve">Introducción </w:t>
+      </w:r>
+    </w:p>
+    <w:p>
+      <w:pPr>
+        <w:jc w:val="center"/>
+        <w:rPr>
+          <w:b/>
+          <w:bCs/>
+          <w:sz w:val="40"/>
+          <w:szCs w:val="40"/>
+        </w:rPr>
       </w:pPr>
       <w:r>
         <w:rPr>
@@ -1101,12 +1185,10 @@
       <w:r>
         <w:rPr>
           <w:rFonts w:ascii="Times New Roman" w:hAnsi="Times New Roman" w:cs="Times New Roman"/>
-          <w:b/>
-          <w:bCs/>
           <w:sz w:val="28"/>
           <w:szCs w:val="28"/>
         </w:rPr>
-        <w:t>Definición del problema</w:t>
+        <w:t>La empresa encargada del suministro de energía debe analizar constantemente los consumos registrados en los hogares para identificar comportamientos que puedan indicar irregularidades o problemas técnicos. En el municipio de Soacha, donde una gran parte de la población pertenece a los estratos 1, 2 y 3 y recibe subsidios en el servicio de energía, es fundamental contar con mecanismos que permitan evaluar si el consumo reportado por cada vivienda es razonable.</w:t>
       </w:r>
     </w:p>
     <w:p>
@@ -1124,7 +1206,7 @@
           <w:sz w:val="28"/>
           <w:szCs w:val="28"/>
         </w:rPr>
-        <w:t>La empresa encargada del suministro de energía debe analizar constantemente los consumos registrados en los hogares para identificar comportamientos que puedan indicar irregularidades o problemas técnicos. En el municipio de Soacha, donde una gran parte de la población pertenece a los estratos 1, 2 y 3 y recibe subsidios en el servicio de energía, es fundamental contar con mecanismos que permitan evaluar si el consumo reportado por cada vivienda es razonable.</w:t>
+        <w:t>Sin embargo, revisar estos datos de manera manual puede ser ineficiente y dificulta detectar rápidamente situaciones fuera de lo común. Por ejemplo, un consumo extremadamente bajo podría indicar una posible alteración del medidor, mientras que un consumo demasiado alto podría reflejar fallas en la instalación eléctrica o un uso inusual de la energía.</w:t>
       </w:r>
     </w:p>
     <w:p>
@@ -1142,24 +1224,6 @@
           <w:sz w:val="28"/>
           <w:szCs w:val="28"/>
         </w:rPr>
-        <w:t>Sin embargo, revisar estos datos de manera manual puede ser ineficiente y dificulta detectar rápidamente situaciones fuera de lo común. Por ejemplo, un consumo extremadamente bajo podría indicar una posible alteración del medidor, mientras que un consumo demasiado alto podría reflejar fallas en la instalación eléctrica o un uso inusual de la energía.</w:t>
-      </w:r>
-    </w:p>
-    <w:p>
-      <w:pPr>
-        <w:jc w:val="center"/>
-        <w:rPr>
-          <w:rFonts w:ascii="Times New Roman" w:hAnsi="Times New Roman" w:cs="Times New Roman"/>
-          <w:sz w:val="28"/>
-          <w:szCs w:val="28"/>
-        </w:rPr>
-      </w:pPr>
-      <w:r>
-        <w:rPr>
-          <w:rFonts w:ascii="Times New Roman" w:hAnsi="Times New Roman" w:cs="Times New Roman"/>
-          <w:sz w:val="28"/>
-          <w:szCs w:val="28"/>
-        </w:rPr>
         <w:t>Ante esta situación, surge la necesidad de desarrollar un sistema que permita analizar automáticamente los consumos registrados, clasificarlos según rangos establecidos y generar alertas únicamente cuando se detecten valores sospechosos o excesivos. De esta manera, la empresa podrá tomar decisiones oportunas, optimizar las inspecciones técnicas y mejorar el control del servicio energético en los hogares.</w:t>
       </w:r>
     </w:p>
@@ -1240,7 +1304,10 @@
           <w:szCs w:val="40"/>
         </w:rPr>
       </w:pPr>
-      <w:r>
+    </w:p>
+    <w:p>
+      <w:pPr>
+        <w:jc w:val="center"/>
         <w:rPr>
           <w:rFonts w:ascii="Algerian" w:hAnsi="Algerian"/>
           <w:b/>
@@ -1248,6 +1315,15 @@
           <w:sz w:val="40"/>
           <w:szCs w:val="40"/>
         </w:rPr>
+      </w:pPr>
+      <w:r>
+        <w:rPr>
+          <w:rFonts w:ascii="Algerian" w:hAnsi="Algerian"/>
+          <w:b/>
+          <w:bCs/>
+          <w:sz w:val="40"/>
+          <w:szCs w:val="40"/>
+        </w:rPr>
         <w:t>Reglas o condiciones.</w:t>
       </w:r>
     </w:p>
@@ -1298,13 +1374,7 @@
         <w:rPr>
           <w:rFonts w:ascii="Times New Roman" w:hAnsi="Times New Roman" w:cs="Times New Roman"/>
         </w:rPr>
-        <w:t xml:space="preserve">consumo_kwh = int o float. </w:t>
-      </w:r>
-      <w:r>
-        <w:rPr>
-          <w:rFonts w:ascii="Times New Roman" w:hAnsi="Times New Roman" w:cs="Times New Roman"/>
-        </w:rPr>
-        <w:t>Consumo mensual registrado del hogar (en kWh).</w:t>
+        <w:t>consumo_kwh = int o float. Consumo mensual registrado del hogar (en kWh).</w:t>
       </w:r>
     </w:p>
     <w:p>
@@ -1323,13 +1393,7 @@
         <w:rPr>
           <w:rFonts w:ascii="Times New Roman" w:hAnsi="Times New Roman" w:cs="Times New Roman"/>
         </w:rPr>
-        <w:t xml:space="preserve">estrato = str </w:t>
-      </w:r>
-      <w:r>
-        <w:rPr>
-          <w:rFonts w:ascii="Times New Roman" w:hAnsi="Times New Roman" w:cs="Times New Roman"/>
-        </w:rPr>
-        <w:t>Estrato socioeconómico del hogar (1, 2 o 3).</w:t>
+        <w:t>estrato = str Estrato socioeconómico del hogar (1, 2 o 3).</w:t>
       </w:r>
       <w:r>
         <w:rPr>
@@ -1433,13 +1497,7 @@
         <w:rPr>
           <w:rFonts w:ascii="Times New Roman" w:hAnsi="Times New Roman" w:cs="Times New Roman"/>
         </w:rPr>
-        <w:t>subsidiado</w:t>
-      </w:r>
-      <w:r>
-        <w:rPr>
-          <w:rFonts w:ascii="Times New Roman" w:hAnsi="Times New Roman" w:cs="Times New Roman"/>
-        </w:rPr>
-        <w:t xml:space="preserve"> = </w:t>
+        <w:t xml:space="preserve">subsidiado = </w:t>
       </w:r>
       <w:proofErr w:type="gramStart"/>
       <w:r>
@@ -1499,6 +1557,7 @@
       <w:r>
         <w:rPr>
           <w:rFonts w:ascii="Times New Roman" w:hAnsi="Times New Roman" w:cs="Times New Roman"/>
+          <w:noProof/>
         </w:rPr>
         <w:drawing>
           <wp:anchor distT="0" distB="0" distL="114300" distR="114300" simplePos="0" relativeHeight="251658240" behindDoc="1" locked="0" layoutInCell="1" allowOverlap="1" wp14:anchorId="67B6B00E" wp14:editId="3A9CEB00">
@@ -1847,7 +1906,23 @@
           <w:b/>
           <w:bCs/>
         </w:rPr>
-        <w:t>Consumo demasiado bajo (&lt;100 kWh):</w:t>
+        <w:t>Consumo demasiado bajo (&lt;</w:t>
+      </w:r>
+      <w:r>
+        <w:rPr>
+          <w:rFonts w:ascii="Times New Roman" w:hAnsi="Times New Roman" w:cs="Times New Roman"/>
+          <w:b/>
+          <w:bCs/>
+        </w:rPr>
+        <w:t>=</w:t>
+      </w:r>
+      <w:r>
+        <w:rPr>
+          <w:rFonts w:ascii="Times New Roman" w:hAnsi="Times New Roman" w:cs="Times New Roman"/>
+          <w:b/>
+          <w:bCs/>
+        </w:rPr>
+        <w:t>100 kWh):</w:t>
       </w:r>
     </w:p>
     <w:p>
@@ -2822,6 +2897,7 @@
           <w:szCs w:val="40"/>
         </w:rPr>
       </w:pPr>
+      <w:proofErr w:type="gramStart"/>
       <w:r>
         <w:rPr>
           <w:rFonts w:ascii="Algerian" w:hAnsi="Algerian"/>
@@ -2832,9 +2908,3297 @@
         </w:rPr>
         <w:t xml:space="preserve">Diagrama </w:t>
       </w:r>
+      <w:r>
+        <w:rPr>
+          <w:rFonts w:ascii="Algerian" w:hAnsi="Algerian"/>
+          <w:b/>
+          <w:bCs/>
+          <w:sz w:val="40"/>
+          <w:szCs w:val="40"/>
+        </w:rPr>
+        <w:t xml:space="preserve"> MER</w:t>
+      </w:r>
+      <w:proofErr w:type="gramEnd"/>
+      <w:r>
+        <w:rPr>
+          <w:rFonts w:ascii="Algerian" w:hAnsi="Algerian"/>
+          <w:b/>
+          <w:bCs/>
+          <w:sz w:val="40"/>
+          <w:szCs w:val="40"/>
+        </w:rPr>
+        <w:t>.</w:t>
+      </w:r>
+      <w:r>
+        <w:rPr>
+          <w:rFonts w:ascii="Algerian" w:hAnsi="Algerian"/>
+          <w:b/>
+          <w:bCs/>
+          <w:sz w:val="40"/>
+          <w:szCs w:val="40"/>
+        </w:rPr>
+        <w:br/>
+      </w:r>
+      <w:r>
+        <w:rPr>
+          <w:rFonts w:ascii="Algerian" w:hAnsi="Algerian"/>
+          <w:b/>
+          <w:bCs/>
+          <w:noProof/>
+          <w:sz w:val="40"/>
+          <w:szCs w:val="40"/>
+        </w:rPr>
+        <w:drawing>
+          <wp:inline distT="0" distB="0" distL="0" distR="0" wp14:anchorId="61D77DE1" wp14:editId="53EE9367">
+            <wp:extent cx="5612130" cy="4173855"/>
+            <wp:effectExtent l="0" t="0" r="7620" b="0"/>
+            <wp:docPr id="690291085" name="Imagen 1"/>
+            <wp:cNvGraphicFramePr>
+              <a:graphicFrameLocks xmlns:a="http://schemas.openxmlformats.org/drawingml/2006/main" noChangeAspect="1"/>
+            </wp:cNvGraphicFramePr>
+            <a:graphic xmlns:a="http://schemas.openxmlformats.org/drawingml/2006/main">
+              <a:graphicData uri="http://schemas.openxmlformats.org/drawingml/2006/picture">
+                <pic:pic xmlns:pic="http://schemas.openxmlformats.org/drawingml/2006/picture">
+                  <pic:nvPicPr>
+                    <pic:cNvPr id="690291085" name=""/>
+                    <pic:cNvPicPr/>
+                  </pic:nvPicPr>
+                  <pic:blipFill>
+                    <a:blip r:embed="rId8"/>
+                    <a:stretch>
+                      <a:fillRect/>
+                    </a:stretch>
+                  </pic:blipFill>
+                  <pic:spPr>
+                    <a:xfrm>
+                      <a:off x="0" y="0"/>
+                      <a:ext cx="5612130" cy="4173855"/>
+                    </a:xfrm>
+                    <a:prstGeom prst="rect">
+                      <a:avLst/>
+                    </a:prstGeom>
+                  </pic:spPr>
+                </pic:pic>
+              </a:graphicData>
+            </a:graphic>
+          </wp:inline>
+        </w:drawing>
+      </w:r>
+    </w:p>
+    <w:p>
+      <w:pPr>
+        <w:tabs>
+          <w:tab w:val="left" w:pos="4896"/>
+        </w:tabs>
+        <w:jc w:val="center"/>
+        <w:rPr>
+          <w:rFonts w:ascii="Algerian" w:hAnsi="Algerian"/>
+          <w:sz w:val="40"/>
+          <w:szCs w:val="40"/>
+        </w:rPr>
+      </w:pPr>
+    </w:p>
+    <w:p>
+      <w:pPr>
+        <w:tabs>
+          <w:tab w:val="left" w:pos="4896"/>
+        </w:tabs>
+        <w:jc w:val="center"/>
+        <w:rPr>
+          <w:rFonts w:ascii="Algerian" w:hAnsi="Algerian"/>
+          <w:sz w:val="40"/>
+          <w:szCs w:val="40"/>
+        </w:rPr>
+      </w:pPr>
+    </w:p>
+    <w:p>
+      <w:pPr>
+        <w:tabs>
+          <w:tab w:val="left" w:pos="4896"/>
+        </w:tabs>
+        <w:jc w:val="center"/>
+        <w:rPr>
+          <w:rFonts w:ascii="Algerian" w:hAnsi="Algerian"/>
+          <w:sz w:val="40"/>
+          <w:szCs w:val="40"/>
+        </w:rPr>
+      </w:pPr>
+    </w:p>
+    <w:p>
+      <w:pPr>
+        <w:tabs>
+          <w:tab w:val="left" w:pos="4896"/>
+        </w:tabs>
+        <w:jc w:val="center"/>
+        <w:rPr>
+          <w:rFonts w:ascii="Algerian" w:hAnsi="Algerian"/>
+          <w:sz w:val="40"/>
+          <w:szCs w:val="40"/>
+        </w:rPr>
+      </w:pPr>
+    </w:p>
+    <w:p>
+      <w:pPr>
+        <w:tabs>
+          <w:tab w:val="left" w:pos="4896"/>
+        </w:tabs>
+        <w:jc w:val="center"/>
+        <w:rPr>
+          <w:rFonts w:ascii="Algerian" w:hAnsi="Algerian"/>
+          <w:sz w:val="40"/>
+          <w:szCs w:val="40"/>
+        </w:rPr>
+      </w:pPr>
+    </w:p>
+    <w:p>
+      <w:pPr>
+        <w:tabs>
+          <w:tab w:val="left" w:pos="4896"/>
+        </w:tabs>
+        <w:jc w:val="center"/>
+        <w:rPr>
+          <w:rFonts w:ascii="Algerian" w:hAnsi="Algerian"/>
+          <w:sz w:val="40"/>
+          <w:szCs w:val="40"/>
+        </w:rPr>
+      </w:pPr>
+    </w:p>
+    <w:p>
+      <w:pPr>
+        <w:tabs>
+          <w:tab w:val="left" w:pos="4896"/>
+        </w:tabs>
+        <w:rPr>
+          <w:rFonts w:ascii="Algerian" w:hAnsi="Algerian"/>
+          <w:sz w:val="40"/>
+          <w:szCs w:val="40"/>
+        </w:rPr>
+      </w:pPr>
+    </w:p>
+    <w:p>
+      <w:pPr>
+        <w:tabs>
+          <w:tab w:val="left" w:pos="4896"/>
+        </w:tabs>
+        <w:jc w:val="center"/>
+        <w:rPr>
+          <w:rFonts w:ascii="Algerian" w:hAnsi="Algerian"/>
+          <w:sz w:val="40"/>
+          <w:szCs w:val="40"/>
+        </w:rPr>
+      </w:pPr>
+      <w:r>
+        <w:rPr>
+          <w:rFonts w:ascii="Algerian" w:hAnsi="Algerian"/>
+          <w:sz w:val="40"/>
+          <w:szCs w:val="40"/>
+        </w:rPr>
+        <w:t>Diagrama de flujo.</w:t>
+      </w:r>
+    </w:p>
+    <w:p>
+      <w:pPr>
+        <w:tabs>
+          <w:tab w:val="left" w:pos="4896"/>
+        </w:tabs>
+        <w:jc w:val="center"/>
+        <w:rPr>
+          <w:rFonts w:ascii="Algerian" w:hAnsi="Algerian"/>
+          <w:sz w:val="40"/>
+          <w:szCs w:val="40"/>
+        </w:rPr>
+      </w:pPr>
+      <w:r>
+        <w:rPr>
+          <w:rFonts w:ascii="Algerian" w:hAnsi="Algerian"/>
+          <w:noProof/>
+          <w:sz w:val="40"/>
+          <w:szCs w:val="40"/>
+        </w:rPr>
+        <w:drawing>
+          <wp:inline distT="0" distB="0" distL="0" distR="0" wp14:anchorId="100CF415" wp14:editId="36C57305">
+            <wp:extent cx="5612130" cy="4758690"/>
+            <wp:effectExtent l="0" t="0" r="7620" b="3810"/>
+            <wp:docPr id="1183700312" name="Imagen 1"/>
+            <wp:cNvGraphicFramePr>
+              <a:graphicFrameLocks xmlns:a="http://schemas.openxmlformats.org/drawingml/2006/main" noChangeAspect="1"/>
+            </wp:cNvGraphicFramePr>
+            <a:graphic xmlns:a="http://schemas.openxmlformats.org/drawingml/2006/main">
+              <a:graphicData uri="http://schemas.openxmlformats.org/drawingml/2006/picture">
+                <pic:pic xmlns:pic="http://schemas.openxmlformats.org/drawingml/2006/picture">
+                  <pic:nvPicPr>
+                    <pic:cNvPr id="1183700312" name=""/>
+                    <pic:cNvPicPr/>
+                  </pic:nvPicPr>
+                  <pic:blipFill>
+                    <a:blip r:embed="rId9"/>
+                    <a:stretch>
+                      <a:fillRect/>
+                    </a:stretch>
+                  </pic:blipFill>
+                  <pic:spPr>
+                    <a:xfrm>
+                      <a:off x="0" y="0"/>
+                      <a:ext cx="5612130" cy="4758690"/>
+                    </a:xfrm>
+                    <a:prstGeom prst="rect">
+                      <a:avLst/>
+                    </a:prstGeom>
+                  </pic:spPr>
+                </pic:pic>
+              </a:graphicData>
+            </a:graphic>
+          </wp:inline>
+        </w:drawing>
+      </w:r>
+    </w:p>
+    <w:p>
+      <w:pPr>
+        <w:tabs>
+          <w:tab w:val="left" w:pos="4896"/>
+        </w:tabs>
+        <w:jc w:val="center"/>
+        <w:rPr>
+          <w:rFonts w:ascii="Algerian" w:hAnsi="Algerian"/>
+          <w:sz w:val="40"/>
+          <w:szCs w:val="40"/>
+        </w:rPr>
+      </w:pPr>
+    </w:p>
+    <w:p>
+      <w:pPr>
+        <w:tabs>
+          <w:tab w:val="left" w:pos="4896"/>
+        </w:tabs>
+        <w:jc w:val="center"/>
+        <w:rPr>
+          <w:rFonts w:ascii="Algerian" w:hAnsi="Algerian"/>
+          <w:sz w:val="40"/>
+          <w:szCs w:val="40"/>
+        </w:rPr>
+      </w:pPr>
+    </w:p>
+    <w:p>
+      <w:pPr>
+        <w:tabs>
+          <w:tab w:val="left" w:pos="4896"/>
+        </w:tabs>
+        <w:jc w:val="center"/>
+        <w:rPr>
+          <w:rFonts w:ascii="Algerian" w:hAnsi="Algerian"/>
+          <w:sz w:val="40"/>
+          <w:szCs w:val="40"/>
+        </w:rPr>
+      </w:pPr>
+    </w:p>
+    <w:p>
+      <w:pPr>
+        <w:tabs>
+          <w:tab w:val="left" w:pos="4896"/>
+        </w:tabs>
+        <w:jc w:val="center"/>
+        <w:rPr>
+          <w:rFonts w:ascii="Algerian" w:hAnsi="Algerian"/>
+          <w:sz w:val="40"/>
+          <w:szCs w:val="40"/>
+        </w:rPr>
+      </w:pPr>
+    </w:p>
+    <w:p>
+      <w:pPr>
+        <w:tabs>
+          <w:tab w:val="left" w:pos="4896"/>
+        </w:tabs>
+        <w:jc w:val="center"/>
+        <w:rPr>
+          <w:rFonts w:ascii="Algerian" w:hAnsi="Algerian"/>
+          <w:sz w:val="40"/>
+          <w:szCs w:val="40"/>
+        </w:rPr>
+      </w:pPr>
+    </w:p>
+    <w:p>
+      <w:pPr>
+        <w:tabs>
+          <w:tab w:val="left" w:pos="4896"/>
+        </w:tabs>
+        <w:jc w:val="center"/>
+        <w:rPr>
+          <w:rFonts w:ascii="Algerian" w:hAnsi="Algerian"/>
+          <w:sz w:val="40"/>
+          <w:szCs w:val="40"/>
+        </w:rPr>
+      </w:pPr>
+    </w:p>
+    <w:p>
+      <w:pPr>
+        <w:tabs>
+          <w:tab w:val="left" w:pos="4896"/>
+        </w:tabs>
+        <w:jc w:val="center"/>
+        <w:rPr>
+          <w:rFonts w:ascii="Algerian" w:hAnsi="Algerian"/>
+          <w:sz w:val="40"/>
+          <w:szCs w:val="40"/>
+        </w:rPr>
+      </w:pPr>
+      <w:r>
+        <w:rPr>
+          <w:rFonts w:ascii="Algerian" w:hAnsi="Algerian"/>
+          <w:sz w:val="40"/>
+          <w:szCs w:val="40"/>
+        </w:rPr>
+        <w:t>Variables de entrada (inputs).</w:t>
+      </w:r>
+    </w:p>
+    <w:tbl>
+      <w:tblPr>
+        <w:tblW w:w="0" w:type="auto"/>
+        <w:jc w:val="center"/>
+        <w:tblCellSpacing w:w="15" w:type="dxa"/>
+        <w:tblCellMar>
+          <w:left w:w="0" w:type="dxa"/>
+          <w:right w:w="0" w:type="dxa"/>
+        </w:tblCellMar>
+        <w:tblLook w:val="04A0" w:firstRow="1" w:lastRow="0" w:firstColumn="1" w:lastColumn="0" w:noHBand="0" w:noVBand="1"/>
+      </w:tblPr>
+      <w:tblGrid>
+        <w:gridCol w:w="1655"/>
+        <w:gridCol w:w="1667"/>
+        <w:gridCol w:w="5500"/>
+      </w:tblGrid>
+      <w:tr>
+        <w:trPr>
+          <w:tblHeader/>
+          <w:tblCellSpacing w:w="15" w:type="dxa"/>
+          <w:jc w:val="center"/>
+        </w:trPr>
+        <w:tc>
+          <w:tcPr>
+            <w:tcW w:w="0" w:type="auto"/>
+            <w:tcBorders>
+              <w:top w:val="single" w:sz="6" w:space="0" w:color="auto"/>
+              <w:left w:val="single" w:sz="6" w:space="0" w:color="auto"/>
+              <w:bottom w:val="single" w:sz="6" w:space="0" w:color="auto"/>
+              <w:right w:val="single" w:sz="6" w:space="0" w:color="auto"/>
+            </w:tcBorders>
+            <w:tcMar>
+              <w:top w:w="240" w:type="dxa"/>
+              <w:left w:w="0" w:type="dxa"/>
+              <w:bottom w:w="240" w:type="dxa"/>
+              <w:right w:w="180" w:type="dxa"/>
+            </w:tcMar>
+            <w:vAlign w:val="center"/>
+            <w:hideMark/>
+          </w:tcPr>
+          <w:p>
+            <w:pPr>
+              <w:tabs>
+                <w:tab w:val="left" w:pos="4896"/>
+              </w:tabs>
+              <w:jc w:val="center"/>
+              <w:rPr>
+                <w:rFonts w:ascii="Times New Roman" w:hAnsi="Times New Roman" w:cs="Times New Roman"/>
+              </w:rPr>
+            </w:pPr>
+            <w:r>
+              <w:rPr>
+                <w:rFonts w:ascii="Times New Roman" w:hAnsi="Times New Roman" w:cs="Times New Roman"/>
+                <w:b/>
+                <w:bCs/>
+              </w:rPr>
+              <w:t>Variable</w:t>
+            </w:r>
+          </w:p>
+        </w:tc>
+        <w:tc>
+          <w:tcPr>
+            <w:tcW w:w="0" w:type="auto"/>
+            <w:tcBorders>
+              <w:top w:val="single" w:sz="6" w:space="0" w:color="auto"/>
+              <w:left w:val="single" w:sz="6" w:space="0" w:color="auto"/>
+              <w:bottom w:val="single" w:sz="6" w:space="0" w:color="auto"/>
+              <w:right w:val="single" w:sz="6" w:space="0" w:color="auto"/>
+            </w:tcBorders>
+            <w:tcMar>
+              <w:top w:w="240" w:type="dxa"/>
+              <w:left w:w="0" w:type="dxa"/>
+              <w:bottom w:w="240" w:type="dxa"/>
+              <w:right w:w="180" w:type="dxa"/>
+            </w:tcMar>
+            <w:vAlign w:val="center"/>
+            <w:hideMark/>
+          </w:tcPr>
+          <w:p>
+            <w:pPr>
+              <w:tabs>
+                <w:tab w:val="left" w:pos="4896"/>
+              </w:tabs>
+              <w:jc w:val="center"/>
+              <w:rPr>
+                <w:rFonts w:ascii="Times New Roman" w:hAnsi="Times New Roman" w:cs="Times New Roman"/>
+              </w:rPr>
+            </w:pPr>
+            <w:r>
+              <w:rPr>
+                <w:rFonts w:ascii="Times New Roman" w:hAnsi="Times New Roman" w:cs="Times New Roman"/>
+                <w:b/>
+                <w:bCs/>
+              </w:rPr>
+              <w:t>Tipo de Dato</w:t>
+            </w:r>
+          </w:p>
+        </w:tc>
+        <w:tc>
+          <w:tcPr>
+            <w:tcW w:w="0" w:type="auto"/>
+            <w:tcBorders>
+              <w:top w:val="single" w:sz="6" w:space="0" w:color="auto"/>
+              <w:left w:val="single" w:sz="6" w:space="0" w:color="auto"/>
+              <w:bottom w:val="single" w:sz="6" w:space="0" w:color="auto"/>
+              <w:right w:val="single" w:sz="6" w:space="0" w:color="auto"/>
+            </w:tcBorders>
+            <w:tcMar>
+              <w:top w:w="240" w:type="dxa"/>
+              <w:left w:w="0" w:type="dxa"/>
+              <w:bottom w:w="240" w:type="dxa"/>
+              <w:right w:w="0" w:type="dxa"/>
+            </w:tcMar>
+            <w:vAlign w:val="center"/>
+            <w:hideMark/>
+          </w:tcPr>
+          <w:p>
+            <w:pPr>
+              <w:tabs>
+                <w:tab w:val="left" w:pos="4896"/>
+              </w:tabs>
+              <w:jc w:val="center"/>
+              <w:rPr>
+                <w:rFonts w:ascii="Times New Roman" w:hAnsi="Times New Roman" w:cs="Times New Roman"/>
+              </w:rPr>
+            </w:pPr>
+            <w:r>
+              <w:rPr>
+                <w:rFonts w:ascii="Times New Roman" w:hAnsi="Times New Roman" w:cs="Times New Roman"/>
+                <w:b/>
+                <w:bCs/>
+              </w:rPr>
+              <w:t>Descripción</w:t>
+            </w:r>
+          </w:p>
+        </w:tc>
+      </w:tr>
+      <w:tr>
+        <w:trPr>
+          <w:tblCellSpacing w:w="15" w:type="dxa"/>
+          <w:jc w:val="center"/>
+        </w:trPr>
+        <w:tc>
+          <w:tcPr>
+            <w:tcW w:w="0" w:type="auto"/>
+            <w:tcBorders>
+              <w:top w:val="single" w:sz="6" w:space="0" w:color="auto"/>
+              <w:left w:val="single" w:sz="6" w:space="0" w:color="auto"/>
+              <w:bottom w:val="single" w:sz="6" w:space="0" w:color="auto"/>
+              <w:right w:val="single" w:sz="6" w:space="0" w:color="auto"/>
+            </w:tcBorders>
+            <w:tcMar>
+              <w:top w:w="240" w:type="dxa"/>
+              <w:left w:w="0" w:type="dxa"/>
+              <w:bottom w:w="240" w:type="dxa"/>
+              <w:right w:w="180" w:type="dxa"/>
+            </w:tcMar>
+            <w:vAlign w:val="center"/>
+            <w:hideMark/>
+          </w:tcPr>
+          <w:p>
+            <w:pPr>
+              <w:tabs>
+                <w:tab w:val="left" w:pos="4896"/>
+              </w:tabs>
+              <w:jc w:val="center"/>
+              <w:rPr>
+                <w:rFonts w:ascii="Times New Roman" w:hAnsi="Times New Roman" w:cs="Times New Roman"/>
+              </w:rPr>
+            </w:pPr>
+            <w:proofErr w:type="spellStart"/>
+            <w:r>
+              <w:rPr>
+                <w:rFonts w:ascii="Times New Roman" w:hAnsi="Times New Roman" w:cs="Times New Roman"/>
+              </w:rPr>
+              <w:t>id_contador</w:t>
+            </w:r>
+            <w:proofErr w:type="spellEnd"/>
+          </w:p>
+        </w:tc>
+        <w:tc>
+          <w:tcPr>
+            <w:tcW w:w="0" w:type="auto"/>
+            <w:tcBorders>
+              <w:top w:val="single" w:sz="6" w:space="0" w:color="auto"/>
+              <w:left w:val="single" w:sz="6" w:space="0" w:color="auto"/>
+              <w:bottom w:val="single" w:sz="6" w:space="0" w:color="auto"/>
+              <w:right w:val="single" w:sz="6" w:space="0" w:color="auto"/>
+            </w:tcBorders>
+            <w:tcMar>
+              <w:top w:w="240" w:type="dxa"/>
+              <w:left w:w="0" w:type="dxa"/>
+              <w:bottom w:w="240" w:type="dxa"/>
+              <w:right w:w="180" w:type="dxa"/>
+            </w:tcMar>
+            <w:vAlign w:val="center"/>
+            <w:hideMark/>
+          </w:tcPr>
+          <w:p>
+            <w:pPr>
+              <w:tabs>
+                <w:tab w:val="left" w:pos="4896"/>
+              </w:tabs>
+              <w:jc w:val="center"/>
+              <w:rPr>
+                <w:rFonts w:ascii="Times New Roman" w:hAnsi="Times New Roman" w:cs="Times New Roman"/>
+              </w:rPr>
+            </w:pPr>
+            <w:r>
+              <w:rPr>
+                <w:rFonts w:ascii="Times New Roman" w:hAnsi="Times New Roman" w:cs="Times New Roman"/>
+              </w:rPr>
+              <w:t>Entero (</w:t>
+            </w:r>
+            <w:proofErr w:type="spellStart"/>
+            <w:r>
+              <w:rPr>
+                <w:rFonts w:ascii="Times New Roman" w:hAnsi="Times New Roman" w:cs="Times New Roman"/>
+              </w:rPr>
+              <w:t>int</w:t>
+            </w:r>
+            <w:proofErr w:type="spellEnd"/>
+            <w:r>
+              <w:rPr>
+                <w:rFonts w:ascii="Times New Roman" w:hAnsi="Times New Roman" w:cs="Times New Roman"/>
+              </w:rPr>
+              <w:t>)</w:t>
+            </w:r>
+          </w:p>
+        </w:tc>
+        <w:tc>
+          <w:tcPr>
+            <w:tcW w:w="0" w:type="auto"/>
+            <w:tcBorders>
+              <w:top w:val="single" w:sz="6" w:space="0" w:color="auto"/>
+              <w:left w:val="single" w:sz="6" w:space="0" w:color="auto"/>
+              <w:bottom w:val="single" w:sz="6" w:space="0" w:color="auto"/>
+              <w:right w:val="single" w:sz="6" w:space="0" w:color="auto"/>
+            </w:tcBorders>
+            <w:tcMar>
+              <w:top w:w="240" w:type="dxa"/>
+              <w:left w:w="0" w:type="dxa"/>
+              <w:bottom w:w="240" w:type="dxa"/>
+              <w:right w:w="0" w:type="dxa"/>
+            </w:tcMar>
+            <w:vAlign w:val="center"/>
+            <w:hideMark/>
+          </w:tcPr>
+          <w:p>
+            <w:pPr>
+              <w:tabs>
+                <w:tab w:val="left" w:pos="4896"/>
+              </w:tabs>
+              <w:jc w:val="center"/>
+              <w:rPr>
+                <w:rFonts w:ascii="Times New Roman" w:hAnsi="Times New Roman" w:cs="Times New Roman"/>
+              </w:rPr>
+            </w:pPr>
+            <w:r>
+              <w:rPr>
+                <w:rFonts w:ascii="Times New Roman" w:hAnsi="Times New Roman" w:cs="Times New Roman"/>
+              </w:rPr>
+              <w:t>Identificador único del medidor del hogar (Llave Primaria).</w:t>
+            </w:r>
+          </w:p>
+        </w:tc>
+      </w:tr>
+      <w:tr>
+        <w:trPr>
+          <w:tblCellSpacing w:w="15" w:type="dxa"/>
+          <w:jc w:val="center"/>
+        </w:trPr>
+        <w:tc>
+          <w:tcPr>
+            <w:tcW w:w="0" w:type="auto"/>
+            <w:tcBorders>
+              <w:top w:val="single" w:sz="6" w:space="0" w:color="auto"/>
+              <w:left w:val="single" w:sz="6" w:space="0" w:color="auto"/>
+              <w:bottom w:val="single" w:sz="6" w:space="0" w:color="auto"/>
+              <w:right w:val="single" w:sz="6" w:space="0" w:color="auto"/>
+            </w:tcBorders>
+            <w:tcMar>
+              <w:top w:w="240" w:type="dxa"/>
+              <w:left w:w="0" w:type="dxa"/>
+              <w:bottom w:w="240" w:type="dxa"/>
+              <w:right w:w="180" w:type="dxa"/>
+            </w:tcMar>
+            <w:vAlign w:val="center"/>
+            <w:hideMark/>
+          </w:tcPr>
+          <w:p>
+            <w:pPr>
+              <w:tabs>
+                <w:tab w:val="left" w:pos="4896"/>
+              </w:tabs>
+              <w:jc w:val="center"/>
+              <w:rPr>
+                <w:rFonts w:ascii="Times New Roman" w:hAnsi="Times New Roman" w:cs="Times New Roman"/>
+              </w:rPr>
+            </w:pPr>
+            <w:proofErr w:type="spellStart"/>
+            <w:r>
+              <w:rPr>
+                <w:rFonts w:ascii="Times New Roman" w:hAnsi="Times New Roman" w:cs="Times New Roman"/>
+              </w:rPr>
+              <w:t>consumo_kwh</w:t>
+            </w:r>
+            <w:proofErr w:type="spellEnd"/>
+          </w:p>
+        </w:tc>
+        <w:tc>
+          <w:tcPr>
+            <w:tcW w:w="0" w:type="auto"/>
+            <w:tcBorders>
+              <w:top w:val="single" w:sz="6" w:space="0" w:color="auto"/>
+              <w:left w:val="single" w:sz="6" w:space="0" w:color="auto"/>
+              <w:bottom w:val="single" w:sz="6" w:space="0" w:color="auto"/>
+              <w:right w:val="single" w:sz="6" w:space="0" w:color="auto"/>
+            </w:tcBorders>
+            <w:tcMar>
+              <w:top w:w="240" w:type="dxa"/>
+              <w:left w:w="0" w:type="dxa"/>
+              <w:bottom w:w="240" w:type="dxa"/>
+              <w:right w:w="180" w:type="dxa"/>
+            </w:tcMar>
+            <w:vAlign w:val="center"/>
+            <w:hideMark/>
+          </w:tcPr>
+          <w:p>
+            <w:pPr>
+              <w:tabs>
+                <w:tab w:val="left" w:pos="4896"/>
+              </w:tabs>
+              <w:jc w:val="center"/>
+              <w:rPr>
+                <w:rFonts w:ascii="Times New Roman" w:hAnsi="Times New Roman" w:cs="Times New Roman"/>
+              </w:rPr>
+            </w:pPr>
+            <w:r>
+              <w:rPr>
+                <w:rFonts w:ascii="Times New Roman" w:hAnsi="Times New Roman" w:cs="Times New Roman"/>
+              </w:rPr>
+              <w:t>Decimal (</w:t>
+            </w:r>
+            <w:proofErr w:type="spellStart"/>
+            <w:r>
+              <w:rPr>
+                <w:rFonts w:ascii="Times New Roman" w:hAnsi="Times New Roman" w:cs="Times New Roman"/>
+              </w:rPr>
+              <w:t>float</w:t>
+            </w:r>
+            <w:proofErr w:type="spellEnd"/>
+            <w:r>
+              <w:rPr>
+                <w:rFonts w:ascii="Times New Roman" w:hAnsi="Times New Roman" w:cs="Times New Roman"/>
+              </w:rPr>
+              <w:t>)</w:t>
+            </w:r>
+          </w:p>
+        </w:tc>
+        <w:tc>
+          <w:tcPr>
+            <w:tcW w:w="0" w:type="auto"/>
+            <w:tcBorders>
+              <w:top w:val="single" w:sz="6" w:space="0" w:color="auto"/>
+              <w:left w:val="single" w:sz="6" w:space="0" w:color="auto"/>
+              <w:bottom w:val="single" w:sz="6" w:space="0" w:color="auto"/>
+              <w:right w:val="single" w:sz="6" w:space="0" w:color="auto"/>
+            </w:tcBorders>
+            <w:tcMar>
+              <w:top w:w="240" w:type="dxa"/>
+              <w:left w:w="0" w:type="dxa"/>
+              <w:bottom w:w="240" w:type="dxa"/>
+              <w:right w:w="0" w:type="dxa"/>
+            </w:tcMar>
+            <w:vAlign w:val="center"/>
+            <w:hideMark/>
+          </w:tcPr>
+          <w:p>
+            <w:pPr>
+              <w:tabs>
+                <w:tab w:val="left" w:pos="4896"/>
+              </w:tabs>
+              <w:jc w:val="center"/>
+              <w:rPr>
+                <w:rFonts w:ascii="Times New Roman" w:hAnsi="Times New Roman" w:cs="Times New Roman"/>
+              </w:rPr>
+            </w:pPr>
+            <w:r>
+              <w:rPr>
+                <w:rFonts w:ascii="Times New Roman" w:hAnsi="Times New Roman" w:cs="Times New Roman"/>
+              </w:rPr>
+              <w:t>Cantidad de energía registrada mensualmente en el hogar.</w:t>
+            </w:r>
+          </w:p>
+        </w:tc>
+      </w:tr>
+      <w:tr>
+        <w:trPr>
+          <w:tblCellSpacing w:w="15" w:type="dxa"/>
+          <w:jc w:val="center"/>
+        </w:trPr>
+        <w:tc>
+          <w:tcPr>
+            <w:tcW w:w="0" w:type="auto"/>
+            <w:tcBorders>
+              <w:top w:val="single" w:sz="6" w:space="0" w:color="auto"/>
+              <w:left w:val="single" w:sz="6" w:space="0" w:color="auto"/>
+              <w:bottom w:val="single" w:sz="6" w:space="0" w:color="auto"/>
+              <w:right w:val="single" w:sz="6" w:space="0" w:color="auto"/>
+            </w:tcBorders>
+            <w:tcMar>
+              <w:top w:w="240" w:type="dxa"/>
+              <w:left w:w="0" w:type="dxa"/>
+              <w:bottom w:w="240" w:type="dxa"/>
+              <w:right w:w="180" w:type="dxa"/>
+            </w:tcMar>
+            <w:vAlign w:val="center"/>
+            <w:hideMark/>
+          </w:tcPr>
+          <w:p>
+            <w:pPr>
+              <w:tabs>
+                <w:tab w:val="left" w:pos="4896"/>
+              </w:tabs>
+              <w:jc w:val="center"/>
+              <w:rPr>
+                <w:rFonts w:ascii="Times New Roman" w:hAnsi="Times New Roman" w:cs="Times New Roman"/>
+              </w:rPr>
+            </w:pPr>
+            <w:proofErr w:type="spellStart"/>
+            <w:r>
+              <w:rPr>
+                <w:rFonts w:ascii="Times New Roman" w:hAnsi="Times New Roman" w:cs="Times New Roman"/>
+              </w:rPr>
+              <w:t>id_estrato</w:t>
+            </w:r>
+            <w:proofErr w:type="spellEnd"/>
+          </w:p>
+        </w:tc>
+        <w:tc>
+          <w:tcPr>
+            <w:tcW w:w="0" w:type="auto"/>
+            <w:tcBorders>
+              <w:top w:val="single" w:sz="6" w:space="0" w:color="auto"/>
+              <w:left w:val="single" w:sz="6" w:space="0" w:color="auto"/>
+              <w:bottom w:val="single" w:sz="6" w:space="0" w:color="auto"/>
+              <w:right w:val="single" w:sz="6" w:space="0" w:color="auto"/>
+            </w:tcBorders>
+            <w:tcMar>
+              <w:top w:w="240" w:type="dxa"/>
+              <w:left w:w="0" w:type="dxa"/>
+              <w:bottom w:w="240" w:type="dxa"/>
+              <w:right w:w="180" w:type="dxa"/>
+            </w:tcMar>
+            <w:vAlign w:val="center"/>
+            <w:hideMark/>
+          </w:tcPr>
+          <w:p>
+            <w:pPr>
+              <w:tabs>
+                <w:tab w:val="left" w:pos="4896"/>
+              </w:tabs>
+              <w:jc w:val="center"/>
+              <w:rPr>
+                <w:rFonts w:ascii="Times New Roman" w:hAnsi="Times New Roman" w:cs="Times New Roman"/>
+              </w:rPr>
+            </w:pPr>
+            <w:r>
+              <w:rPr>
+                <w:rFonts w:ascii="Times New Roman" w:hAnsi="Times New Roman" w:cs="Times New Roman"/>
+              </w:rPr>
+              <w:t>Entero (</w:t>
+            </w:r>
+            <w:proofErr w:type="spellStart"/>
+            <w:r>
+              <w:rPr>
+                <w:rFonts w:ascii="Times New Roman" w:hAnsi="Times New Roman" w:cs="Times New Roman"/>
+              </w:rPr>
+              <w:t>int</w:t>
+            </w:r>
+            <w:proofErr w:type="spellEnd"/>
+            <w:r>
+              <w:rPr>
+                <w:rFonts w:ascii="Times New Roman" w:hAnsi="Times New Roman" w:cs="Times New Roman"/>
+              </w:rPr>
+              <w:t>)</w:t>
+            </w:r>
+          </w:p>
+        </w:tc>
+        <w:tc>
+          <w:tcPr>
+            <w:tcW w:w="0" w:type="auto"/>
+            <w:tcBorders>
+              <w:top w:val="single" w:sz="6" w:space="0" w:color="auto"/>
+              <w:left w:val="single" w:sz="6" w:space="0" w:color="auto"/>
+              <w:bottom w:val="single" w:sz="6" w:space="0" w:color="auto"/>
+              <w:right w:val="single" w:sz="6" w:space="0" w:color="auto"/>
+            </w:tcBorders>
+            <w:tcMar>
+              <w:top w:w="240" w:type="dxa"/>
+              <w:left w:w="0" w:type="dxa"/>
+              <w:bottom w:w="240" w:type="dxa"/>
+              <w:right w:w="0" w:type="dxa"/>
+            </w:tcMar>
+            <w:vAlign w:val="center"/>
+            <w:hideMark/>
+          </w:tcPr>
+          <w:p>
+            <w:pPr>
+              <w:tabs>
+                <w:tab w:val="left" w:pos="4896"/>
+              </w:tabs>
+              <w:jc w:val="center"/>
+              <w:rPr>
+                <w:rFonts w:ascii="Times New Roman" w:hAnsi="Times New Roman" w:cs="Times New Roman"/>
+              </w:rPr>
+            </w:pPr>
+            <w:r>
+              <w:rPr>
+                <w:rFonts w:ascii="Times New Roman" w:hAnsi="Times New Roman" w:cs="Times New Roman"/>
+              </w:rPr>
+              <w:t>Nivel socioeconómico del hogar: 1, 2 o 3.</w:t>
+            </w:r>
+          </w:p>
+        </w:tc>
+      </w:tr>
+      <w:tr>
+        <w:trPr>
+          <w:tblCellSpacing w:w="15" w:type="dxa"/>
+          <w:jc w:val="center"/>
+        </w:trPr>
+        <w:tc>
+          <w:tcPr>
+            <w:tcW w:w="0" w:type="auto"/>
+            <w:tcBorders>
+              <w:top w:val="single" w:sz="6" w:space="0" w:color="auto"/>
+              <w:left w:val="single" w:sz="6" w:space="0" w:color="auto"/>
+              <w:bottom w:val="single" w:sz="6" w:space="0" w:color="auto"/>
+              <w:right w:val="single" w:sz="6" w:space="0" w:color="auto"/>
+            </w:tcBorders>
+            <w:tcMar>
+              <w:top w:w="240" w:type="dxa"/>
+              <w:left w:w="0" w:type="dxa"/>
+              <w:bottom w:w="240" w:type="dxa"/>
+              <w:right w:w="180" w:type="dxa"/>
+            </w:tcMar>
+            <w:vAlign w:val="center"/>
+            <w:hideMark/>
+          </w:tcPr>
+          <w:p>
+            <w:pPr>
+              <w:tabs>
+                <w:tab w:val="left" w:pos="4896"/>
+              </w:tabs>
+              <w:jc w:val="center"/>
+              <w:rPr>
+                <w:rFonts w:ascii="Times New Roman" w:hAnsi="Times New Roman" w:cs="Times New Roman"/>
+              </w:rPr>
+            </w:pPr>
+            <w:proofErr w:type="spellStart"/>
+            <w:r>
+              <w:rPr>
+                <w:rFonts w:ascii="Times New Roman" w:hAnsi="Times New Roman" w:cs="Times New Roman"/>
+              </w:rPr>
+              <w:t>tipo_hogar</w:t>
+            </w:r>
+            <w:proofErr w:type="spellEnd"/>
+          </w:p>
+        </w:tc>
+        <w:tc>
+          <w:tcPr>
+            <w:tcW w:w="0" w:type="auto"/>
+            <w:tcBorders>
+              <w:top w:val="single" w:sz="6" w:space="0" w:color="auto"/>
+              <w:left w:val="single" w:sz="6" w:space="0" w:color="auto"/>
+              <w:bottom w:val="single" w:sz="6" w:space="0" w:color="auto"/>
+              <w:right w:val="single" w:sz="6" w:space="0" w:color="auto"/>
+            </w:tcBorders>
+            <w:tcMar>
+              <w:top w:w="240" w:type="dxa"/>
+              <w:left w:w="0" w:type="dxa"/>
+              <w:bottom w:w="240" w:type="dxa"/>
+              <w:right w:w="180" w:type="dxa"/>
+            </w:tcMar>
+            <w:vAlign w:val="center"/>
+            <w:hideMark/>
+          </w:tcPr>
+          <w:p>
+            <w:pPr>
+              <w:tabs>
+                <w:tab w:val="left" w:pos="4896"/>
+              </w:tabs>
+              <w:jc w:val="center"/>
+              <w:rPr>
+                <w:rFonts w:ascii="Times New Roman" w:hAnsi="Times New Roman" w:cs="Times New Roman"/>
+              </w:rPr>
+            </w:pPr>
+            <w:r>
+              <w:rPr>
+                <w:rFonts w:ascii="Times New Roman" w:hAnsi="Times New Roman" w:cs="Times New Roman"/>
+              </w:rPr>
+              <w:t>Texto (</w:t>
+            </w:r>
+            <w:proofErr w:type="spellStart"/>
+            <w:r>
+              <w:rPr>
+                <w:rFonts w:ascii="Times New Roman" w:hAnsi="Times New Roman" w:cs="Times New Roman"/>
+              </w:rPr>
+              <w:t>str</w:t>
+            </w:r>
+            <w:proofErr w:type="spellEnd"/>
+            <w:r>
+              <w:rPr>
+                <w:rFonts w:ascii="Times New Roman" w:hAnsi="Times New Roman" w:cs="Times New Roman"/>
+              </w:rPr>
+              <w:t>)</w:t>
+            </w:r>
+          </w:p>
+        </w:tc>
+        <w:tc>
+          <w:tcPr>
+            <w:tcW w:w="0" w:type="auto"/>
+            <w:tcBorders>
+              <w:top w:val="single" w:sz="6" w:space="0" w:color="auto"/>
+              <w:left w:val="single" w:sz="6" w:space="0" w:color="auto"/>
+              <w:bottom w:val="single" w:sz="6" w:space="0" w:color="auto"/>
+              <w:right w:val="single" w:sz="6" w:space="0" w:color="auto"/>
+            </w:tcBorders>
+            <w:tcMar>
+              <w:top w:w="240" w:type="dxa"/>
+              <w:left w:w="0" w:type="dxa"/>
+              <w:bottom w:w="240" w:type="dxa"/>
+              <w:right w:w="0" w:type="dxa"/>
+            </w:tcMar>
+            <w:vAlign w:val="center"/>
+            <w:hideMark/>
+          </w:tcPr>
+          <w:p>
+            <w:pPr>
+              <w:tabs>
+                <w:tab w:val="left" w:pos="4896"/>
+              </w:tabs>
+              <w:jc w:val="center"/>
+              <w:rPr>
+                <w:rFonts w:ascii="Times New Roman" w:hAnsi="Times New Roman" w:cs="Times New Roman"/>
+              </w:rPr>
+            </w:pPr>
+            <w:r>
+              <w:rPr>
+                <w:rFonts w:ascii="Times New Roman" w:hAnsi="Times New Roman" w:cs="Times New Roman"/>
+              </w:rPr>
+              <w:t>Clasificación: Pequeño, Mediano o Uso Intensivo.</w:t>
+            </w:r>
+          </w:p>
+        </w:tc>
+      </w:tr>
+      <w:tr>
+        <w:trPr>
+          <w:tblCellSpacing w:w="15" w:type="dxa"/>
+          <w:jc w:val="center"/>
+        </w:trPr>
+        <w:tc>
+          <w:tcPr>
+            <w:tcW w:w="0" w:type="auto"/>
+            <w:tcBorders>
+              <w:top w:val="single" w:sz="6" w:space="0" w:color="auto"/>
+              <w:left w:val="single" w:sz="6" w:space="0" w:color="auto"/>
+              <w:bottom w:val="single" w:sz="6" w:space="0" w:color="auto"/>
+              <w:right w:val="single" w:sz="6" w:space="0" w:color="auto"/>
+            </w:tcBorders>
+            <w:tcMar>
+              <w:top w:w="240" w:type="dxa"/>
+              <w:left w:w="0" w:type="dxa"/>
+              <w:bottom w:w="240" w:type="dxa"/>
+              <w:right w:w="180" w:type="dxa"/>
+            </w:tcMar>
+            <w:vAlign w:val="center"/>
+            <w:hideMark/>
+          </w:tcPr>
+          <w:p>
+            <w:pPr>
+              <w:tabs>
+                <w:tab w:val="left" w:pos="4896"/>
+              </w:tabs>
+              <w:jc w:val="center"/>
+              <w:rPr>
+                <w:rFonts w:ascii="Times New Roman" w:hAnsi="Times New Roman" w:cs="Times New Roman"/>
+              </w:rPr>
+            </w:pPr>
+            <w:proofErr w:type="spellStart"/>
+            <w:r>
+              <w:rPr>
+                <w:rFonts w:ascii="Times New Roman" w:hAnsi="Times New Roman" w:cs="Times New Roman"/>
+              </w:rPr>
+              <w:t>id_empleado</w:t>
+            </w:r>
+            <w:proofErr w:type="spellEnd"/>
+          </w:p>
+        </w:tc>
+        <w:tc>
+          <w:tcPr>
+            <w:tcW w:w="0" w:type="auto"/>
+            <w:tcBorders>
+              <w:top w:val="single" w:sz="6" w:space="0" w:color="auto"/>
+              <w:left w:val="single" w:sz="6" w:space="0" w:color="auto"/>
+              <w:bottom w:val="single" w:sz="6" w:space="0" w:color="auto"/>
+              <w:right w:val="single" w:sz="6" w:space="0" w:color="auto"/>
+            </w:tcBorders>
+            <w:tcMar>
+              <w:top w:w="240" w:type="dxa"/>
+              <w:left w:w="0" w:type="dxa"/>
+              <w:bottom w:w="240" w:type="dxa"/>
+              <w:right w:w="180" w:type="dxa"/>
+            </w:tcMar>
+            <w:vAlign w:val="center"/>
+            <w:hideMark/>
+          </w:tcPr>
+          <w:p>
+            <w:pPr>
+              <w:tabs>
+                <w:tab w:val="left" w:pos="4896"/>
+              </w:tabs>
+              <w:jc w:val="center"/>
+              <w:rPr>
+                <w:rFonts w:ascii="Times New Roman" w:hAnsi="Times New Roman" w:cs="Times New Roman"/>
+              </w:rPr>
+            </w:pPr>
+            <w:r>
+              <w:rPr>
+                <w:rFonts w:ascii="Times New Roman" w:hAnsi="Times New Roman" w:cs="Times New Roman"/>
+              </w:rPr>
+              <w:t>Entero (</w:t>
+            </w:r>
+            <w:proofErr w:type="spellStart"/>
+            <w:r>
+              <w:rPr>
+                <w:rFonts w:ascii="Times New Roman" w:hAnsi="Times New Roman" w:cs="Times New Roman"/>
+              </w:rPr>
+              <w:t>int</w:t>
+            </w:r>
+            <w:proofErr w:type="spellEnd"/>
+            <w:r>
+              <w:rPr>
+                <w:rFonts w:ascii="Times New Roman" w:hAnsi="Times New Roman" w:cs="Times New Roman"/>
+              </w:rPr>
+              <w:t>)</w:t>
+            </w:r>
+          </w:p>
+        </w:tc>
+        <w:tc>
+          <w:tcPr>
+            <w:tcW w:w="0" w:type="auto"/>
+            <w:tcBorders>
+              <w:top w:val="single" w:sz="6" w:space="0" w:color="auto"/>
+              <w:left w:val="single" w:sz="6" w:space="0" w:color="auto"/>
+              <w:bottom w:val="single" w:sz="6" w:space="0" w:color="auto"/>
+              <w:right w:val="single" w:sz="6" w:space="0" w:color="auto"/>
+            </w:tcBorders>
+            <w:tcMar>
+              <w:top w:w="240" w:type="dxa"/>
+              <w:left w:w="0" w:type="dxa"/>
+              <w:bottom w:w="240" w:type="dxa"/>
+              <w:right w:w="0" w:type="dxa"/>
+            </w:tcMar>
+            <w:vAlign w:val="center"/>
+            <w:hideMark/>
+          </w:tcPr>
+          <w:p>
+            <w:pPr>
+              <w:tabs>
+                <w:tab w:val="left" w:pos="4896"/>
+              </w:tabs>
+              <w:jc w:val="center"/>
+              <w:rPr>
+                <w:rFonts w:ascii="Times New Roman" w:hAnsi="Times New Roman" w:cs="Times New Roman"/>
+              </w:rPr>
+            </w:pPr>
+            <w:r>
+              <w:rPr>
+                <w:rFonts w:ascii="Times New Roman" w:hAnsi="Times New Roman" w:cs="Times New Roman"/>
+              </w:rPr>
+              <w:t>Código del técnico que realiza la toma de la lectura.</w:t>
+            </w:r>
+          </w:p>
+        </w:tc>
+      </w:tr>
+    </w:tbl>
+    <w:p>
+      <w:pPr>
+        <w:tabs>
+          <w:tab w:val="left" w:pos="4896"/>
+        </w:tabs>
+        <w:jc w:val="center"/>
+        <w:rPr>
+          <w:rFonts w:ascii="Algerian" w:hAnsi="Algerian" w:cs="Times New Roman"/>
+          <w:b/>
+          <w:bCs/>
+          <w:sz w:val="36"/>
+          <w:szCs w:val="36"/>
+        </w:rPr>
+      </w:pPr>
+    </w:p>
+    <w:p>
+      <w:pPr>
+        <w:tabs>
+          <w:tab w:val="left" w:pos="4896"/>
+        </w:tabs>
+        <w:jc w:val="center"/>
+        <w:rPr>
+          <w:rFonts w:ascii="Algerian" w:hAnsi="Algerian" w:cs="Times New Roman"/>
+          <w:b/>
+          <w:bCs/>
+          <w:sz w:val="36"/>
+          <w:szCs w:val="36"/>
+        </w:rPr>
+      </w:pPr>
+    </w:p>
+    <w:p>
+      <w:pPr>
+        <w:tabs>
+          <w:tab w:val="left" w:pos="4896"/>
+        </w:tabs>
+        <w:jc w:val="center"/>
+        <w:rPr>
+          <w:rFonts w:ascii="Algerian" w:hAnsi="Algerian" w:cs="Times New Roman"/>
+          <w:b/>
+          <w:bCs/>
+          <w:sz w:val="36"/>
+          <w:szCs w:val="36"/>
+        </w:rPr>
+      </w:pPr>
+    </w:p>
+    <w:p>
+      <w:pPr>
+        <w:tabs>
+          <w:tab w:val="left" w:pos="4896"/>
+        </w:tabs>
+        <w:jc w:val="center"/>
+        <w:rPr>
+          <w:rFonts w:ascii="Algerian" w:hAnsi="Algerian" w:cs="Times New Roman"/>
+          <w:b/>
+          <w:bCs/>
+          <w:sz w:val="36"/>
+          <w:szCs w:val="36"/>
+        </w:rPr>
+      </w:pPr>
+    </w:p>
+    <w:p>
+      <w:pPr>
+        <w:tabs>
+          <w:tab w:val="left" w:pos="4896"/>
+        </w:tabs>
+        <w:jc w:val="center"/>
+        <w:rPr>
+          <w:rFonts w:ascii="Algerian" w:hAnsi="Algerian" w:cs="Times New Roman"/>
+          <w:b/>
+          <w:bCs/>
+          <w:sz w:val="36"/>
+          <w:szCs w:val="36"/>
+        </w:rPr>
+      </w:pPr>
+    </w:p>
+    <w:p>
+      <w:pPr>
+        <w:tabs>
+          <w:tab w:val="left" w:pos="4896"/>
+        </w:tabs>
+        <w:jc w:val="center"/>
+        <w:rPr>
+          <w:rFonts w:ascii="Algerian" w:hAnsi="Algerian" w:cs="Times New Roman"/>
+          <w:b/>
+          <w:bCs/>
+          <w:sz w:val="36"/>
+          <w:szCs w:val="36"/>
+        </w:rPr>
+      </w:pPr>
+    </w:p>
+    <w:p>
+      <w:pPr>
+        <w:tabs>
+          <w:tab w:val="left" w:pos="4896"/>
+        </w:tabs>
+        <w:jc w:val="center"/>
+        <w:rPr>
+          <w:rFonts w:ascii="Algerian" w:hAnsi="Algerian" w:cs="Times New Roman"/>
+          <w:b/>
+          <w:bCs/>
+          <w:sz w:val="36"/>
+          <w:szCs w:val="36"/>
+        </w:rPr>
+      </w:pPr>
+    </w:p>
+    <w:p>
+      <w:pPr>
+        <w:tabs>
+          <w:tab w:val="left" w:pos="4896"/>
+        </w:tabs>
+        <w:jc w:val="center"/>
+        <w:rPr>
+          <w:rFonts w:ascii="Algerian" w:hAnsi="Algerian" w:cs="Times New Roman"/>
+          <w:b/>
+          <w:bCs/>
+          <w:sz w:val="36"/>
+          <w:szCs w:val="36"/>
+        </w:rPr>
+      </w:pPr>
+      <w:r>
+        <w:rPr>
+          <w:rFonts w:ascii="Algerian" w:hAnsi="Algerian" w:cs="Times New Roman"/>
+          <w:b/>
+          <w:bCs/>
+          <w:sz w:val="36"/>
+          <w:szCs w:val="36"/>
+        </w:rPr>
+        <w:t>Variables de procesos (cálculos internos)</w:t>
+      </w:r>
+      <w:r>
+        <w:rPr>
+          <w:rFonts w:ascii="Algerian" w:hAnsi="Algerian" w:cs="Times New Roman"/>
+          <w:b/>
+          <w:bCs/>
+          <w:sz w:val="36"/>
+          <w:szCs w:val="36"/>
+        </w:rPr>
+        <w:t>.</w:t>
+      </w:r>
+    </w:p>
+    <w:tbl>
+      <w:tblPr>
+        <w:tblW w:w="0" w:type="auto"/>
+        <w:tblCellSpacing w:w="15" w:type="dxa"/>
+        <w:tblCellMar>
+          <w:left w:w="0" w:type="dxa"/>
+          <w:right w:w="0" w:type="dxa"/>
+        </w:tblCellMar>
+        <w:tblLook w:val="04A0" w:firstRow="1" w:lastRow="0" w:firstColumn="1" w:lastColumn="0" w:noHBand="0" w:noVBand="1"/>
+      </w:tblPr>
+      <w:tblGrid>
+        <w:gridCol w:w="2269"/>
+        <w:gridCol w:w="3049"/>
+        <w:gridCol w:w="3504"/>
+      </w:tblGrid>
+      <w:tr>
+        <w:trPr>
+          <w:tblHeader/>
+          <w:tblCellSpacing w:w="15" w:type="dxa"/>
+        </w:trPr>
+        <w:tc>
+          <w:tcPr>
+            <w:tcW w:w="0" w:type="auto"/>
+            <w:tcBorders>
+              <w:top w:val="single" w:sz="6" w:space="0" w:color="auto"/>
+              <w:left w:val="single" w:sz="6" w:space="0" w:color="auto"/>
+              <w:bottom w:val="single" w:sz="6" w:space="0" w:color="auto"/>
+              <w:right w:val="single" w:sz="6" w:space="0" w:color="auto"/>
+            </w:tcBorders>
+            <w:tcMar>
+              <w:top w:w="240" w:type="dxa"/>
+              <w:left w:w="0" w:type="dxa"/>
+              <w:bottom w:w="240" w:type="dxa"/>
+              <w:right w:w="180" w:type="dxa"/>
+            </w:tcMar>
+            <w:vAlign w:val="center"/>
+            <w:hideMark/>
+          </w:tcPr>
+          <w:p>
+            <w:pPr>
+              <w:tabs>
+                <w:tab w:val="left" w:pos="4896"/>
+              </w:tabs>
+              <w:jc w:val="center"/>
+              <w:rPr>
+                <w:rFonts w:ascii="Times New Roman" w:hAnsi="Times New Roman" w:cs="Times New Roman"/>
+              </w:rPr>
+            </w:pPr>
+            <w:r>
+              <w:rPr>
+                <w:rFonts w:ascii="Times New Roman" w:hAnsi="Times New Roman" w:cs="Times New Roman"/>
+                <w:b/>
+                <w:bCs/>
+              </w:rPr>
+              <w:t>Variable</w:t>
+            </w:r>
+          </w:p>
+        </w:tc>
+        <w:tc>
+          <w:tcPr>
+            <w:tcW w:w="0" w:type="auto"/>
+            <w:tcBorders>
+              <w:top w:val="single" w:sz="6" w:space="0" w:color="auto"/>
+              <w:left w:val="single" w:sz="6" w:space="0" w:color="auto"/>
+              <w:bottom w:val="single" w:sz="6" w:space="0" w:color="auto"/>
+              <w:right w:val="single" w:sz="6" w:space="0" w:color="auto"/>
+            </w:tcBorders>
+            <w:tcMar>
+              <w:top w:w="240" w:type="dxa"/>
+              <w:left w:w="0" w:type="dxa"/>
+              <w:bottom w:w="240" w:type="dxa"/>
+              <w:right w:w="180" w:type="dxa"/>
+            </w:tcMar>
+            <w:vAlign w:val="center"/>
+            <w:hideMark/>
+          </w:tcPr>
+          <w:p>
+            <w:pPr>
+              <w:tabs>
+                <w:tab w:val="left" w:pos="4896"/>
+              </w:tabs>
+              <w:jc w:val="center"/>
+              <w:rPr>
+                <w:rFonts w:ascii="Times New Roman" w:hAnsi="Times New Roman" w:cs="Times New Roman"/>
+              </w:rPr>
+            </w:pPr>
+            <w:r>
+              <w:rPr>
+                <w:rFonts w:ascii="Times New Roman" w:hAnsi="Times New Roman" w:cs="Times New Roman"/>
+                <w:b/>
+                <w:bCs/>
+              </w:rPr>
+              <w:t>Fórmula / Lógica</w:t>
+            </w:r>
+          </w:p>
+        </w:tc>
+        <w:tc>
+          <w:tcPr>
+            <w:tcW w:w="0" w:type="auto"/>
+            <w:tcBorders>
+              <w:top w:val="single" w:sz="6" w:space="0" w:color="auto"/>
+              <w:left w:val="single" w:sz="6" w:space="0" w:color="auto"/>
+              <w:bottom w:val="single" w:sz="6" w:space="0" w:color="auto"/>
+              <w:right w:val="single" w:sz="6" w:space="0" w:color="auto"/>
+            </w:tcBorders>
+            <w:tcMar>
+              <w:top w:w="240" w:type="dxa"/>
+              <w:left w:w="0" w:type="dxa"/>
+              <w:bottom w:w="240" w:type="dxa"/>
+              <w:right w:w="0" w:type="dxa"/>
+            </w:tcMar>
+            <w:vAlign w:val="center"/>
+            <w:hideMark/>
+          </w:tcPr>
+          <w:p>
+            <w:pPr>
+              <w:tabs>
+                <w:tab w:val="left" w:pos="4896"/>
+              </w:tabs>
+              <w:jc w:val="center"/>
+              <w:rPr>
+                <w:rFonts w:ascii="Times New Roman" w:hAnsi="Times New Roman" w:cs="Times New Roman"/>
+              </w:rPr>
+            </w:pPr>
+            <w:r>
+              <w:rPr>
+                <w:rFonts w:ascii="Times New Roman" w:hAnsi="Times New Roman" w:cs="Times New Roman"/>
+                <w:b/>
+                <w:bCs/>
+              </w:rPr>
+              <w:t>Función</w:t>
+            </w:r>
+          </w:p>
+        </w:tc>
+      </w:tr>
+      <w:tr>
+        <w:trPr>
+          <w:tblCellSpacing w:w="15" w:type="dxa"/>
+        </w:trPr>
+        <w:tc>
+          <w:tcPr>
+            <w:tcW w:w="0" w:type="auto"/>
+            <w:tcBorders>
+              <w:top w:val="single" w:sz="6" w:space="0" w:color="auto"/>
+              <w:left w:val="single" w:sz="6" w:space="0" w:color="auto"/>
+              <w:bottom w:val="single" w:sz="6" w:space="0" w:color="auto"/>
+              <w:right w:val="single" w:sz="6" w:space="0" w:color="auto"/>
+            </w:tcBorders>
+            <w:tcMar>
+              <w:top w:w="240" w:type="dxa"/>
+              <w:left w:w="0" w:type="dxa"/>
+              <w:bottom w:w="240" w:type="dxa"/>
+              <w:right w:w="180" w:type="dxa"/>
+            </w:tcMar>
+            <w:vAlign w:val="center"/>
+            <w:hideMark/>
+          </w:tcPr>
+          <w:p>
+            <w:pPr>
+              <w:tabs>
+                <w:tab w:val="left" w:pos="4896"/>
+              </w:tabs>
+              <w:jc w:val="center"/>
+              <w:rPr>
+                <w:rFonts w:ascii="Times New Roman" w:hAnsi="Times New Roman" w:cs="Times New Roman"/>
+              </w:rPr>
+            </w:pPr>
+            <w:proofErr w:type="spellStart"/>
+            <w:r>
+              <w:rPr>
+                <w:rFonts w:ascii="Times New Roman" w:hAnsi="Times New Roman" w:cs="Times New Roman"/>
+              </w:rPr>
+              <w:t>consumo_subsidiado</w:t>
+            </w:r>
+            <w:proofErr w:type="spellEnd"/>
+          </w:p>
+        </w:tc>
+        <w:tc>
+          <w:tcPr>
+            <w:tcW w:w="0" w:type="auto"/>
+            <w:tcBorders>
+              <w:top w:val="single" w:sz="6" w:space="0" w:color="auto"/>
+              <w:left w:val="single" w:sz="6" w:space="0" w:color="auto"/>
+              <w:bottom w:val="single" w:sz="6" w:space="0" w:color="auto"/>
+              <w:right w:val="single" w:sz="6" w:space="0" w:color="auto"/>
+            </w:tcBorders>
+            <w:tcMar>
+              <w:top w:w="240" w:type="dxa"/>
+              <w:left w:w="0" w:type="dxa"/>
+              <w:bottom w:w="240" w:type="dxa"/>
+              <w:right w:w="180" w:type="dxa"/>
+            </w:tcMar>
+            <w:vAlign w:val="center"/>
+            <w:hideMark/>
+          </w:tcPr>
+          <w:p>
+            <w:pPr>
+              <w:tabs>
+                <w:tab w:val="left" w:pos="4896"/>
+              </w:tabs>
+              <w:jc w:val="center"/>
+              <w:rPr>
+                <w:rFonts w:ascii="Times New Roman" w:hAnsi="Times New Roman" w:cs="Times New Roman"/>
+              </w:rPr>
+            </w:pPr>
+            <w:proofErr w:type="gramStart"/>
+            <w:r>
+              <w:rPr>
+                <w:rFonts w:ascii="Times New Roman" w:hAnsi="Times New Roman" w:cs="Times New Roman"/>
+              </w:rPr>
+              <w:t>min(</w:t>
+            </w:r>
+            <w:proofErr w:type="spellStart"/>
+            <w:proofErr w:type="gramEnd"/>
+            <w:r>
+              <w:rPr>
+                <w:rFonts w:ascii="Times New Roman" w:hAnsi="Times New Roman" w:cs="Times New Roman"/>
+              </w:rPr>
+              <w:t>consumo_kwh</w:t>
+            </w:r>
+            <w:proofErr w:type="spellEnd"/>
+            <w:r>
+              <w:rPr>
+                <w:rFonts w:ascii="Times New Roman" w:hAnsi="Times New Roman" w:cs="Times New Roman"/>
+              </w:rPr>
+              <w:t>, 130)</w:t>
+            </w:r>
+          </w:p>
+        </w:tc>
+        <w:tc>
+          <w:tcPr>
+            <w:tcW w:w="0" w:type="auto"/>
+            <w:tcBorders>
+              <w:top w:val="single" w:sz="6" w:space="0" w:color="auto"/>
+              <w:left w:val="single" w:sz="6" w:space="0" w:color="auto"/>
+              <w:bottom w:val="single" w:sz="6" w:space="0" w:color="auto"/>
+              <w:right w:val="single" w:sz="6" w:space="0" w:color="auto"/>
+            </w:tcBorders>
+            <w:tcMar>
+              <w:top w:w="240" w:type="dxa"/>
+              <w:left w:w="0" w:type="dxa"/>
+              <w:bottom w:w="240" w:type="dxa"/>
+              <w:right w:w="0" w:type="dxa"/>
+            </w:tcMar>
+            <w:vAlign w:val="center"/>
+            <w:hideMark/>
+          </w:tcPr>
+          <w:p>
+            <w:pPr>
+              <w:tabs>
+                <w:tab w:val="left" w:pos="4896"/>
+              </w:tabs>
+              <w:jc w:val="center"/>
+              <w:rPr>
+                <w:rFonts w:ascii="Times New Roman" w:hAnsi="Times New Roman" w:cs="Times New Roman"/>
+              </w:rPr>
+            </w:pPr>
+            <w:r>
+              <w:rPr>
+                <w:rFonts w:ascii="Times New Roman" w:hAnsi="Times New Roman" w:cs="Times New Roman"/>
+              </w:rPr>
+              <w:t>Separa los primeros 130 kWh que tienen descuento.</w:t>
+            </w:r>
+          </w:p>
+        </w:tc>
+      </w:tr>
+      <w:tr>
+        <w:trPr>
+          <w:tblCellSpacing w:w="15" w:type="dxa"/>
+        </w:trPr>
+        <w:tc>
+          <w:tcPr>
+            <w:tcW w:w="0" w:type="auto"/>
+            <w:tcBorders>
+              <w:top w:val="single" w:sz="6" w:space="0" w:color="auto"/>
+              <w:left w:val="single" w:sz="6" w:space="0" w:color="auto"/>
+              <w:bottom w:val="single" w:sz="6" w:space="0" w:color="auto"/>
+              <w:right w:val="single" w:sz="6" w:space="0" w:color="auto"/>
+            </w:tcBorders>
+            <w:tcMar>
+              <w:top w:w="240" w:type="dxa"/>
+              <w:left w:w="0" w:type="dxa"/>
+              <w:bottom w:w="240" w:type="dxa"/>
+              <w:right w:w="180" w:type="dxa"/>
+            </w:tcMar>
+            <w:vAlign w:val="center"/>
+            <w:hideMark/>
+          </w:tcPr>
+          <w:p>
+            <w:pPr>
+              <w:tabs>
+                <w:tab w:val="left" w:pos="4896"/>
+              </w:tabs>
+              <w:jc w:val="center"/>
+              <w:rPr>
+                <w:rFonts w:ascii="Times New Roman" w:hAnsi="Times New Roman" w:cs="Times New Roman"/>
+              </w:rPr>
+            </w:pPr>
+            <w:proofErr w:type="spellStart"/>
+            <w:r>
+              <w:rPr>
+                <w:rFonts w:ascii="Times New Roman" w:hAnsi="Times New Roman" w:cs="Times New Roman"/>
+              </w:rPr>
+              <w:t>consumo_excedente</w:t>
+            </w:r>
+            <w:proofErr w:type="spellEnd"/>
+          </w:p>
+        </w:tc>
+        <w:tc>
+          <w:tcPr>
+            <w:tcW w:w="0" w:type="auto"/>
+            <w:tcBorders>
+              <w:top w:val="single" w:sz="6" w:space="0" w:color="auto"/>
+              <w:left w:val="single" w:sz="6" w:space="0" w:color="auto"/>
+              <w:bottom w:val="single" w:sz="6" w:space="0" w:color="auto"/>
+              <w:right w:val="single" w:sz="6" w:space="0" w:color="auto"/>
+            </w:tcBorders>
+            <w:tcMar>
+              <w:top w:w="240" w:type="dxa"/>
+              <w:left w:w="0" w:type="dxa"/>
+              <w:bottom w:w="240" w:type="dxa"/>
+              <w:right w:w="180" w:type="dxa"/>
+            </w:tcMar>
+            <w:vAlign w:val="center"/>
+            <w:hideMark/>
+          </w:tcPr>
+          <w:p>
+            <w:pPr>
+              <w:tabs>
+                <w:tab w:val="left" w:pos="4896"/>
+              </w:tabs>
+              <w:jc w:val="center"/>
+              <w:rPr>
+                <w:rFonts w:ascii="Times New Roman" w:hAnsi="Times New Roman" w:cs="Times New Roman"/>
+              </w:rPr>
+            </w:pPr>
+            <w:proofErr w:type="spellStart"/>
+            <w:proofErr w:type="gramStart"/>
+            <w:r>
+              <w:rPr>
+                <w:rFonts w:ascii="Times New Roman" w:hAnsi="Times New Roman" w:cs="Times New Roman"/>
+              </w:rPr>
+              <w:t>max</w:t>
+            </w:r>
+            <w:proofErr w:type="spellEnd"/>
+            <w:r>
+              <w:rPr>
+                <w:rFonts w:ascii="Times New Roman" w:hAnsi="Times New Roman" w:cs="Times New Roman"/>
+              </w:rPr>
+              <w:t>(</w:t>
+            </w:r>
+            <w:proofErr w:type="gramEnd"/>
+            <w:r>
+              <w:rPr>
+                <w:rFonts w:ascii="Times New Roman" w:hAnsi="Times New Roman" w:cs="Times New Roman"/>
+              </w:rPr>
+              <w:t xml:space="preserve">0, </w:t>
+            </w:r>
+            <w:proofErr w:type="spellStart"/>
+            <w:r>
+              <w:rPr>
+                <w:rFonts w:ascii="Times New Roman" w:hAnsi="Times New Roman" w:cs="Times New Roman"/>
+              </w:rPr>
+              <w:t>consumo_kwh</w:t>
+            </w:r>
+            <w:proofErr w:type="spellEnd"/>
+            <w:r>
+              <w:rPr>
+                <w:rFonts w:ascii="Times New Roman" w:hAnsi="Times New Roman" w:cs="Times New Roman"/>
+              </w:rPr>
+              <w:t xml:space="preserve"> - 130)</w:t>
+            </w:r>
+          </w:p>
+        </w:tc>
+        <w:tc>
+          <w:tcPr>
+            <w:tcW w:w="0" w:type="auto"/>
+            <w:tcBorders>
+              <w:top w:val="single" w:sz="6" w:space="0" w:color="auto"/>
+              <w:left w:val="single" w:sz="6" w:space="0" w:color="auto"/>
+              <w:bottom w:val="single" w:sz="6" w:space="0" w:color="auto"/>
+              <w:right w:val="single" w:sz="6" w:space="0" w:color="auto"/>
+            </w:tcBorders>
+            <w:tcMar>
+              <w:top w:w="240" w:type="dxa"/>
+              <w:left w:w="0" w:type="dxa"/>
+              <w:bottom w:w="240" w:type="dxa"/>
+              <w:right w:w="0" w:type="dxa"/>
+            </w:tcMar>
+            <w:vAlign w:val="center"/>
+            <w:hideMark/>
+          </w:tcPr>
+          <w:p>
+            <w:pPr>
+              <w:tabs>
+                <w:tab w:val="left" w:pos="4896"/>
+              </w:tabs>
+              <w:jc w:val="center"/>
+              <w:rPr>
+                <w:rFonts w:ascii="Times New Roman" w:hAnsi="Times New Roman" w:cs="Times New Roman"/>
+              </w:rPr>
+            </w:pPr>
+            <w:r>
+              <w:rPr>
+                <w:rFonts w:ascii="Times New Roman" w:hAnsi="Times New Roman" w:cs="Times New Roman"/>
+              </w:rPr>
+              <w:t>Calcula los kWh que se cobrarán a tarifa plena.</w:t>
+            </w:r>
+          </w:p>
+        </w:tc>
+      </w:tr>
+      <w:tr>
+        <w:trPr>
+          <w:tblCellSpacing w:w="15" w:type="dxa"/>
+        </w:trPr>
+        <w:tc>
+          <w:tcPr>
+            <w:tcW w:w="0" w:type="auto"/>
+            <w:tcBorders>
+              <w:top w:val="single" w:sz="6" w:space="0" w:color="auto"/>
+              <w:left w:val="single" w:sz="6" w:space="0" w:color="auto"/>
+              <w:bottom w:val="single" w:sz="6" w:space="0" w:color="auto"/>
+              <w:right w:val="single" w:sz="6" w:space="0" w:color="auto"/>
+            </w:tcBorders>
+            <w:tcMar>
+              <w:top w:w="240" w:type="dxa"/>
+              <w:left w:w="0" w:type="dxa"/>
+              <w:bottom w:w="240" w:type="dxa"/>
+              <w:right w:w="180" w:type="dxa"/>
+            </w:tcMar>
+            <w:vAlign w:val="center"/>
+            <w:hideMark/>
+          </w:tcPr>
+          <w:p>
+            <w:pPr>
+              <w:tabs>
+                <w:tab w:val="left" w:pos="4896"/>
+              </w:tabs>
+              <w:jc w:val="center"/>
+              <w:rPr>
+                <w:rFonts w:ascii="Times New Roman" w:hAnsi="Times New Roman" w:cs="Times New Roman"/>
+              </w:rPr>
+            </w:pPr>
+            <w:proofErr w:type="spellStart"/>
+            <w:r>
+              <w:rPr>
+                <w:rFonts w:ascii="Times New Roman" w:hAnsi="Times New Roman" w:cs="Times New Roman"/>
+              </w:rPr>
+              <w:t>beneficio_subsidio</w:t>
+            </w:r>
+            <w:proofErr w:type="spellEnd"/>
+          </w:p>
+        </w:tc>
+        <w:tc>
+          <w:tcPr>
+            <w:tcW w:w="0" w:type="auto"/>
+            <w:tcBorders>
+              <w:top w:val="single" w:sz="6" w:space="0" w:color="auto"/>
+              <w:left w:val="single" w:sz="6" w:space="0" w:color="auto"/>
+              <w:bottom w:val="single" w:sz="6" w:space="0" w:color="auto"/>
+              <w:right w:val="single" w:sz="6" w:space="0" w:color="auto"/>
+            </w:tcBorders>
+            <w:tcMar>
+              <w:top w:w="240" w:type="dxa"/>
+              <w:left w:w="0" w:type="dxa"/>
+              <w:bottom w:w="240" w:type="dxa"/>
+              <w:right w:w="180" w:type="dxa"/>
+            </w:tcMar>
+            <w:vAlign w:val="center"/>
+            <w:hideMark/>
+          </w:tcPr>
+          <w:p>
+            <w:pPr>
+              <w:tabs>
+                <w:tab w:val="left" w:pos="4896"/>
+              </w:tabs>
+              <w:jc w:val="center"/>
+              <w:rPr>
+                <w:rFonts w:ascii="Times New Roman" w:hAnsi="Times New Roman" w:cs="Times New Roman"/>
+              </w:rPr>
+            </w:pPr>
+            <w:r>
+              <w:rPr>
+                <w:rFonts w:ascii="Times New Roman" w:hAnsi="Times New Roman" w:cs="Times New Roman"/>
+              </w:rPr>
+              <w:t xml:space="preserve">Según </w:t>
+            </w:r>
+            <w:proofErr w:type="spellStart"/>
+            <w:r>
+              <w:rPr>
+                <w:rFonts w:ascii="Times New Roman" w:hAnsi="Times New Roman" w:cs="Times New Roman"/>
+              </w:rPr>
+              <w:t>id_estrato</w:t>
+            </w:r>
+            <w:proofErr w:type="spellEnd"/>
+            <w:r>
+              <w:rPr>
+                <w:rFonts w:ascii="Times New Roman" w:hAnsi="Times New Roman" w:cs="Times New Roman"/>
+              </w:rPr>
+              <w:t xml:space="preserve"> (60%, 50%, 15%)</w:t>
+            </w:r>
+          </w:p>
+        </w:tc>
+        <w:tc>
+          <w:tcPr>
+            <w:tcW w:w="0" w:type="auto"/>
+            <w:tcBorders>
+              <w:top w:val="single" w:sz="6" w:space="0" w:color="auto"/>
+              <w:left w:val="single" w:sz="6" w:space="0" w:color="auto"/>
+              <w:bottom w:val="single" w:sz="6" w:space="0" w:color="auto"/>
+              <w:right w:val="single" w:sz="6" w:space="0" w:color="auto"/>
+            </w:tcBorders>
+            <w:tcMar>
+              <w:top w:w="240" w:type="dxa"/>
+              <w:left w:w="0" w:type="dxa"/>
+              <w:bottom w:w="240" w:type="dxa"/>
+              <w:right w:w="0" w:type="dxa"/>
+            </w:tcMar>
+            <w:vAlign w:val="center"/>
+            <w:hideMark/>
+          </w:tcPr>
+          <w:p>
+            <w:pPr>
+              <w:tabs>
+                <w:tab w:val="left" w:pos="4896"/>
+              </w:tabs>
+              <w:jc w:val="center"/>
+              <w:rPr>
+                <w:rFonts w:ascii="Times New Roman" w:hAnsi="Times New Roman" w:cs="Times New Roman"/>
+              </w:rPr>
+            </w:pPr>
+            <w:r>
+              <w:rPr>
+                <w:rFonts w:ascii="Times New Roman" w:hAnsi="Times New Roman" w:cs="Times New Roman"/>
+              </w:rPr>
+              <w:t>Determina el ahorro según la tabla de estratos.</w:t>
+            </w:r>
+          </w:p>
+        </w:tc>
+      </w:tr>
+    </w:tbl>
+    <w:p>
+      <w:pPr>
+        <w:tabs>
+          <w:tab w:val="left" w:pos="4896"/>
+        </w:tabs>
+        <w:jc w:val="center"/>
+        <w:rPr>
+          <w:rFonts w:ascii="Times New Roman" w:hAnsi="Times New Roman" w:cs="Times New Roman"/>
+        </w:rPr>
+      </w:pPr>
+    </w:p>
+    <w:p>
+      <w:pPr>
+        <w:tabs>
+          <w:tab w:val="left" w:pos="4896"/>
+        </w:tabs>
+        <w:jc w:val="center"/>
+        <w:rPr>
+          <w:rFonts w:ascii="Times New Roman" w:hAnsi="Times New Roman" w:cs="Times New Roman"/>
+        </w:rPr>
+      </w:pPr>
+    </w:p>
+    <w:p>
+      <w:pPr>
+        <w:tabs>
+          <w:tab w:val="left" w:pos="4896"/>
+        </w:tabs>
+        <w:jc w:val="center"/>
+        <w:rPr>
+          <w:rFonts w:ascii="Times New Roman" w:hAnsi="Times New Roman" w:cs="Times New Roman"/>
+        </w:rPr>
+      </w:pPr>
+    </w:p>
+    <w:p>
+      <w:pPr>
+        <w:tabs>
+          <w:tab w:val="left" w:pos="4896"/>
+        </w:tabs>
+        <w:jc w:val="center"/>
+        <w:rPr>
+          <w:rFonts w:ascii="Times New Roman" w:hAnsi="Times New Roman" w:cs="Times New Roman"/>
+        </w:rPr>
+      </w:pPr>
+    </w:p>
+    <w:p>
+      <w:pPr>
+        <w:tabs>
+          <w:tab w:val="left" w:pos="4896"/>
+        </w:tabs>
+        <w:jc w:val="center"/>
+        <w:rPr>
+          <w:rFonts w:ascii="Times New Roman" w:hAnsi="Times New Roman" w:cs="Times New Roman"/>
+        </w:rPr>
+      </w:pPr>
+    </w:p>
+    <w:p>
+      <w:pPr>
+        <w:tabs>
+          <w:tab w:val="left" w:pos="4896"/>
+        </w:tabs>
+        <w:jc w:val="center"/>
+        <w:rPr>
+          <w:rFonts w:ascii="Times New Roman" w:hAnsi="Times New Roman" w:cs="Times New Roman"/>
+        </w:rPr>
+      </w:pPr>
+    </w:p>
+    <w:p>
+      <w:pPr>
+        <w:tabs>
+          <w:tab w:val="left" w:pos="4896"/>
+        </w:tabs>
+        <w:jc w:val="center"/>
+        <w:rPr>
+          <w:rFonts w:ascii="Times New Roman" w:hAnsi="Times New Roman" w:cs="Times New Roman"/>
+        </w:rPr>
+      </w:pPr>
+    </w:p>
+    <w:p>
+      <w:pPr>
+        <w:tabs>
+          <w:tab w:val="left" w:pos="4896"/>
+        </w:tabs>
+        <w:jc w:val="center"/>
+        <w:rPr>
+          <w:rFonts w:ascii="Times New Roman" w:hAnsi="Times New Roman" w:cs="Times New Roman"/>
+        </w:rPr>
+      </w:pPr>
+    </w:p>
+    <w:p>
+      <w:pPr>
+        <w:tabs>
+          <w:tab w:val="left" w:pos="4896"/>
+        </w:tabs>
+        <w:jc w:val="center"/>
+        <w:rPr>
+          <w:rFonts w:ascii="Times New Roman" w:hAnsi="Times New Roman" w:cs="Times New Roman"/>
+        </w:rPr>
+      </w:pPr>
+    </w:p>
+    <w:p>
+      <w:pPr>
+        <w:tabs>
+          <w:tab w:val="left" w:pos="4896"/>
+        </w:tabs>
+        <w:jc w:val="center"/>
+        <w:rPr>
+          <w:rFonts w:ascii="Times New Roman" w:hAnsi="Times New Roman" w:cs="Times New Roman"/>
+        </w:rPr>
+      </w:pPr>
+    </w:p>
+    <w:p>
+      <w:pPr>
+        <w:tabs>
+          <w:tab w:val="left" w:pos="4896"/>
+        </w:tabs>
+        <w:jc w:val="center"/>
+        <w:rPr>
+          <w:rFonts w:ascii="Times New Roman" w:hAnsi="Times New Roman" w:cs="Times New Roman"/>
+        </w:rPr>
+      </w:pPr>
+    </w:p>
+    <w:p>
+      <w:pPr>
+        <w:tabs>
+          <w:tab w:val="left" w:pos="4896"/>
+        </w:tabs>
+        <w:jc w:val="center"/>
+        <w:rPr>
+          <w:rFonts w:ascii="Times New Roman" w:hAnsi="Times New Roman" w:cs="Times New Roman"/>
+        </w:rPr>
+      </w:pPr>
+    </w:p>
+    <w:p>
+      <w:pPr>
+        <w:tabs>
+          <w:tab w:val="left" w:pos="4896"/>
+        </w:tabs>
+        <w:jc w:val="center"/>
+        <w:rPr>
+          <w:rFonts w:ascii="Times New Roman" w:hAnsi="Times New Roman" w:cs="Times New Roman"/>
+        </w:rPr>
+      </w:pPr>
+    </w:p>
+    <w:p>
+      <w:pPr>
+        <w:tabs>
+          <w:tab w:val="left" w:pos="4896"/>
+        </w:tabs>
+        <w:jc w:val="center"/>
+        <w:rPr>
+          <w:rFonts w:ascii="Times New Roman" w:hAnsi="Times New Roman" w:cs="Times New Roman"/>
+        </w:rPr>
+      </w:pPr>
+    </w:p>
+    <w:p>
+      <w:pPr>
+        <w:tabs>
+          <w:tab w:val="left" w:pos="4896"/>
+        </w:tabs>
+        <w:jc w:val="center"/>
+        <w:rPr>
+          <w:rFonts w:ascii="Times New Roman" w:hAnsi="Times New Roman" w:cs="Times New Roman"/>
+        </w:rPr>
+      </w:pPr>
+    </w:p>
+    <w:p>
+      <w:pPr>
+        <w:tabs>
+          <w:tab w:val="left" w:pos="4896"/>
+        </w:tabs>
+        <w:jc w:val="center"/>
+        <w:rPr>
+          <w:rFonts w:ascii="Algerian" w:hAnsi="Algerian" w:cs="Times New Roman"/>
+          <w:sz w:val="40"/>
+          <w:szCs w:val="40"/>
+        </w:rPr>
+      </w:pPr>
+      <w:r>
+        <w:rPr>
+          <w:rFonts w:ascii="Algerian" w:hAnsi="Algerian" w:cs="Times New Roman"/>
+          <w:b/>
+          <w:bCs/>
+          <w:sz w:val="40"/>
+          <w:szCs w:val="40"/>
+        </w:rPr>
+        <w:t>Variables de salida (outp</w:t>
+      </w:r>
+      <w:r>
+        <w:rPr>
+          <w:rFonts w:ascii="Algerian" w:hAnsi="Algerian" w:cs="Times New Roman"/>
+          <w:b/>
+          <w:bCs/>
+          <w:sz w:val="40"/>
+          <w:szCs w:val="40"/>
+        </w:rPr>
+        <w:t>uts</w:t>
+      </w:r>
+      <w:r>
+        <w:rPr>
+          <w:rFonts w:ascii="Algerian" w:hAnsi="Algerian" w:cs="Times New Roman"/>
+          <w:b/>
+          <w:bCs/>
+          <w:sz w:val="40"/>
+          <w:szCs w:val="40"/>
+        </w:rPr>
+        <w:t>)</w:t>
+      </w:r>
+      <w:r>
+        <w:rPr>
+          <w:rFonts w:ascii="Algerian" w:hAnsi="Algerian" w:cs="Times New Roman"/>
+          <w:b/>
+          <w:bCs/>
+          <w:sz w:val="40"/>
+          <w:szCs w:val="40"/>
+        </w:rPr>
+        <w:t>.</w:t>
+      </w:r>
+    </w:p>
+    <w:tbl>
+      <w:tblPr>
+        <w:tblW w:w="0" w:type="auto"/>
+        <w:jc w:val="center"/>
+        <w:tblCellSpacing w:w="15" w:type="dxa"/>
+        <w:tblCellMar>
+          <w:left w:w="0" w:type="dxa"/>
+          <w:right w:w="0" w:type="dxa"/>
+        </w:tblCellMar>
+        <w:tblLook w:val="04A0" w:firstRow="1" w:lastRow="0" w:firstColumn="1" w:lastColumn="0" w:noHBand="0" w:noVBand="1"/>
+      </w:tblPr>
+      <w:tblGrid>
+        <w:gridCol w:w="2281"/>
+        <w:gridCol w:w="1644"/>
+        <w:gridCol w:w="4897"/>
+      </w:tblGrid>
+      <w:tr>
+        <w:trPr>
+          <w:tblHeader/>
+          <w:tblCellSpacing w:w="15" w:type="dxa"/>
+          <w:jc w:val="center"/>
+        </w:trPr>
+        <w:tc>
+          <w:tcPr>
+            <w:tcW w:w="0" w:type="auto"/>
+            <w:tcBorders>
+              <w:top w:val="single" w:sz="6" w:space="0" w:color="auto"/>
+              <w:left w:val="single" w:sz="6" w:space="0" w:color="auto"/>
+              <w:bottom w:val="single" w:sz="6" w:space="0" w:color="auto"/>
+              <w:right w:val="single" w:sz="6" w:space="0" w:color="auto"/>
+            </w:tcBorders>
+            <w:tcMar>
+              <w:top w:w="240" w:type="dxa"/>
+              <w:left w:w="0" w:type="dxa"/>
+              <w:bottom w:w="240" w:type="dxa"/>
+              <w:right w:w="180" w:type="dxa"/>
+            </w:tcMar>
+            <w:vAlign w:val="center"/>
+            <w:hideMark/>
+          </w:tcPr>
+          <w:p>
+            <w:pPr>
+              <w:tabs>
+                <w:tab w:val="left" w:pos="4896"/>
+              </w:tabs>
+              <w:spacing w:line="240" w:lineRule="auto"/>
+              <w:jc w:val="center"/>
+              <w:rPr>
+                <w:rFonts w:ascii="Times New Roman" w:hAnsi="Times New Roman" w:cs="Times New Roman"/>
+              </w:rPr>
+            </w:pPr>
+            <w:r>
+              <w:rPr>
+                <w:rFonts w:ascii="Times New Roman" w:hAnsi="Times New Roman" w:cs="Times New Roman"/>
+                <w:b/>
+                <w:bCs/>
+              </w:rPr>
+              <w:t>Variable</w:t>
+            </w:r>
+          </w:p>
+        </w:tc>
+        <w:tc>
+          <w:tcPr>
+            <w:tcW w:w="0" w:type="auto"/>
+            <w:tcBorders>
+              <w:top w:val="single" w:sz="6" w:space="0" w:color="auto"/>
+              <w:left w:val="single" w:sz="6" w:space="0" w:color="auto"/>
+              <w:bottom w:val="single" w:sz="6" w:space="0" w:color="auto"/>
+              <w:right w:val="single" w:sz="6" w:space="0" w:color="auto"/>
+            </w:tcBorders>
+            <w:tcMar>
+              <w:top w:w="240" w:type="dxa"/>
+              <w:left w:w="0" w:type="dxa"/>
+              <w:bottom w:w="240" w:type="dxa"/>
+              <w:right w:w="180" w:type="dxa"/>
+            </w:tcMar>
+            <w:vAlign w:val="center"/>
+            <w:hideMark/>
+          </w:tcPr>
+          <w:p>
+            <w:pPr>
+              <w:tabs>
+                <w:tab w:val="left" w:pos="4896"/>
+              </w:tabs>
+              <w:spacing w:line="240" w:lineRule="auto"/>
+              <w:jc w:val="center"/>
+              <w:rPr>
+                <w:rFonts w:ascii="Times New Roman" w:hAnsi="Times New Roman" w:cs="Times New Roman"/>
+              </w:rPr>
+            </w:pPr>
+            <w:r>
+              <w:rPr>
+                <w:rFonts w:ascii="Times New Roman" w:hAnsi="Times New Roman" w:cs="Times New Roman"/>
+                <w:b/>
+                <w:bCs/>
+              </w:rPr>
+              <w:t>Tipo de Dato</w:t>
+            </w:r>
+          </w:p>
+        </w:tc>
+        <w:tc>
+          <w:tcPr>
+            <w:tcW w:w="0" w:type="auto"/>
+            <w:tcBorders>
+              <w:top w:val="single" w:sz="6" w:space="0" w:color="auto"/>
+              <w:left w:val="single" w:sz="6" w:space="0" w:color="auto"/>
+              <w:bottom w:val="single" w:sz="6" w:space="0" w:color="auto"/>
+              <w:right w:val="single" w:sz="6" w:space="0" w:color="auto"/>
+            </w:tcBorders>
+            <w:tcMar>
+              <w:top w:w="240" w:type="dxa"/>
+              <w:left w:w="0" w:type="dxa"/>
+              <w:bottom w:w="240" w:type="dxa"/>
+              <w:right w:w="0" w:type="dxa"/>
+            </w:tcMar>
+            <w:vAlign w:val="center"/>
+            <w:hideMark/>
+          </w:tcPr>
+          <w:p>
+            <w:pPr>
+              <w:tabs>
+                <w:tab w:val="left" w:pos="4896"/>
+              </w:tabs>
+              <w:spacing w:line="240" w:lineRule="auto"/>
+              <w:jc w:val="center"/>
+              <w:rPr>
+                <w:rFonts w:ascii="Times New Roman" w:hAnsi="Times New Roman" w:cs="Times New Roman"/>
+              </w:rPr>
+            </w:pPr>
+            <w:r>
+              <w:rPr>
+                <w:rFonts w:ascii="Times New Roman" w:hAnsi="Times New Roman" w:cs="Times New Roman"/>
+                <w:b/>
+                <w:bCs/>
+              </w:rPr>
+              <w:t>Resultado Final</w:t>
+            </w:r>
+          </w:p>
+        </w:tc>
+      </w:tr>
+      <w:tr>
+        <w:trPr>
+          <w:tblCellSpacing w:w="15" w:type="dxa"/>
+          <w:jc w:val="center"/>
+        </w:trPr>
+        <w:tc>
+          <w:tcPr>
+            <w:tcW w:w="0" w:type="auto"/>
+            <w:tcBorders>
+              <w:top w:val="single" w:sz="6" w:space="0" w:color="auto"/>
+              <w:left w:val="single" w:sz="6" w:space="0" w:color="auto"/>
+              <w:bottom w:val="single" w:sz="6" w:space="0" w:color="auto"/>
+              <w:right w:val="single" w:sz="6" w:space="0" w:color="auto"/>
+            </w:tcBorders>
+            <w:tcMar>
+              <w:top w:w="240" w:type="dxa"/>
+              <w:left w:w="0" w:type="dxa"/>
+              <w:bottom w:w="240" w:type="dxa"/>
+              <w:right w:w="180" w:type="dxa"/>
+            </w:tcMar>
+            <w:vAlign w:val="center"/>
+            <w:hideMark/>
+          </w:tcPr>
+          <w:p>
+            <w:pPr>
+              <w:tabs>
+                <w:tab w:val="left" w:pos="4896"/>
+              </w:tabs>
+              <w:spacing w:line="240" w:lineRule="auto"/>
+              <w:jc w:val="center"/>
+              <w:rPr>
+                <w:rFonts w:ascii="Times New Roman" w:hAnsi="Times New Roman" w:cs="Times New Roman"/>
+              </w:rPr>
+            </w:pPr>
+            <w:proofErr w:type="spellStart"/>
+            <w:r>
+              <w:rPr>
+                <w:rFonts w:ascii="Times New Roman" w:hAnsi="Times New Roman" w:cs="Times New Roman"/>
+              </w:rPr>
+              <w:t>tipo_alerta</w:t>
+            </w:r>
+            <w:proofErr w:type="spellEnd"/>
+          </w:p>
+        </w:tc>
+        <w:tc>
+          <w:tcPr>
+            <w:tcW w:w="0" w:type="auto"/>
+            <w:tcBorders>
+              <w:top w:val="single" w:sz="6" w:space="0" w:color="auto"/>
+              <w:left w:val="single" w:sz="6" w:space="0" w:color="auto"/>
+              <w:bottom w:val="single" w:sz="6" w:space="0" w:color="auto"/>
+              <w:right w:val="single" w:sz="6" w:space="0" w:color="auto"/>
+            </w:tcBorders>
+            <w:tcMar>
+              <w:top w:w="240" w:type="dxa"/>
+              <w:left w:w="0" w:type="dxa"/>
+              <w:bottom w:w="240" w:type="dxa"/>
+              <w:right w:w="180" w:type="dxa"/>
+            </w:tcMar>
+            <w:vAlign w:val="center"/>
+            <w:hideMark/>
+          </w:tcPr>
+          <w:p>
+            <w:pPr>
+              <w:tabs>
+                <w:tab w:val="left" w:pos="4896"/>
+              </w:tabs>
+              <w:spacing w:line="240" w:lineRule="auto"/>
+              <w:jc w:val="center"/>
+              <w:rPr>
+                <w:rFonts w:ascii="Times New Roman" w:hAnsi="Times New Roman" w:cs="Times New Roman"/>
+              </w:rPr>
+            </w:pPr>
+            <w:r>
+              <w:rPr>
+                <w:rFonts w:ascii="Times New Roman" w:hAnsi="Times New Roman" w:cs="Times New Roman"/>
+              </w:rPr>
+              <w:t>Texto (</w:t>
+            </w:r>
+            <w:proofErr w:type="spellStart"/>
+            <w:r>
+              <w:rPr>
+                <w:rFonts w:ascii="Times New Roman" w:hAnsi="Times New Roman" w:cs="Times New Roman"/>
+              </w:rPr>
+              <w:t>str</w:t>
+            </w:r>
+            <w:proofErr w:type="spellEnd"/>
+            <w:r>
+              <w:rPr>
+                <w:rFonts w:ascii="Times New Roman" w:hAnsi="Times New Roman" w:cs="Times New Roman"/>
+              </w:rPr>
+              <w:t>)</w:t>
+            </w:r>
+          </w:p>
+        </w:tc>
+        <w:tc>
+          <w:tcPr>
+            <w:tcW w:w="0" w:type="auto"/>
+            <w:tcBorders>
+              <w:top w:val="single" w:sz="6" w:space="0" w:color="auto"/>
+              <w:left w:val="single" w:sz="6" w:space="0" w:color="auto"/>
+              <w:bottom w:val="single" w:sz="6" w:space="0" w:color="auto"/>
+              <w:right w:val="single" w:sz="6" w:space="0" w:color="auto"/>
+            </w:tcBorders>
+            <w:tcMar>
+              <w:top w:w="240" w:type="dxa"/>
+              <w:left w:w="0" w:type="dxa"/>
+              <w:bottom w:w="240" w:type="dxa"/>
+              <w:right w:w="0" w:type="dxa"/>
+            </w:tcMar>
+            <w:vAlign w:val="center"/>
+            <w:hideMark/>
+          </w:tcPr>
+          <w:p>
+            <w:pPr>
+              <w:tabs>
+                <w:tab w:val="left" w:pos="4896"/>
+              </w:tabs>
+              <w:spacing w:line="240" w:lineRule="auto"/>
+              <w:jc w:val="center"/>
+              <w:rPr>
+                <w:rFonts w:ascii="Times New Roman" w:hAnsi="Times New Roman" w:cs="Times New Roman"/>
+              </w:rPr>
+            </w:pPr>
+            <w:r>
+              <w:rPr>
+                <w:rFonts w:ascii="Times New Roman" w:hAnsi="Times New Roman" w:cs="Times New Roman"/>
+              </w:rPr>
+              <w:t xml:space="preserve">Clasifica como: </w:t>
+            </w:r>
+            <w:r>
+              <w:rPr>
+                <w:rFonts w:ascii="Times New Roman" w:hAnsi="Times New Roman" w:cs="Times New Roman"/>
+                <w:b/>
+                <w:bCs/>
+              </w:rPr>
+              <w:t>Bajo</w:t>
+            </w:r>
+            <w:r>
+              <w:rPr>
+                <w:rFonts w:ascii="Times New Roman" w:hAnsi="Times New Roman" w:cs="Times New Roman"/>
+              </w:rPr>
+              <w:t xml:space="preserve">, </w:t>
+            </w:r>
+            <w:r>
+              <w:rPr>
+                <w:rFonts w:ascii="Times New Roman" w:hAnsi="Times New Roman" w:cs="Times New Roman"/>
+                <w:b/>
+                <w:bCs/>
+              </w:rPr>
+              <w:t>Normal</w:t>
+            </w:r>
+            <w:r>
+              <w:rPr>
+                <w:rFonts w:ascii="Times New Roman" w:hAnsi="Times New Roman" w:cs="Times New Roman"/>
+              </w:rPr>
+              <w:t xml:space="preserve">, </w:t>
+            </w:r>
+            <w:r>
+              <w:rPr>
+                <w:rFonts w:ascii="Times New Roman" w:hAnsi="Times New Roman" w:cs="Times New Roman"/>
+                <w:b/>
+                <w:bCs/>
+              </w:rPr>
+              <w:t>Preventiva</w:t>
+            </w:r>
+            <w:r>
+              <w:rPr>
+                <w:rFonts w:ascii="Times New Roman" w:hAnsi="Times New Roman" w:cs="Times New Roman"/>
+              </w:rPr>
+              <w:t xml:space="preserve"> o </w:t>
+            </w:r>
+            <w:r>
+              <w:rPr>
+                <w:rFonts w:ascii="Times New Roman" w:hAnsi="Times New Roman" w:cs="Times New Roman"/>
+                <w:b/>
+                <w:bCs/>
+              </w:rPr>
+              <w:t>Urgente</w:t>
+            </w:r>
+            <w:r>
+              <w:rPr>
+                <w:rFonts w:ascii="Times New Roman" w:hAnsi="Times New Roman" w:cs="Times New Roman"/>
+              </w:rPr>
+              <w:t>.</w:t>
+            </w:r>
+          </w:p>
+        </w:tc>
+      </w:tr>
+      <w:tr>
+        <w:trPr>
+          <w:tblCellSpacing w:w="15" w:type="dxa"/>
+          <w:jc w:val="center"/>
+        </w:trPr>
+        <w:tc>
+          <w:tcPr>
+            <w:tcW w:w="0" w:type="auto"/>
+            <w:tcBorders>
+              <w:top w:val="single" w:sz="6" w:space="0" w:color="auto"/>
+              <w:left w:val="single" w:sz="6" w:space="0" w:color="auto"/>
+              <w:bottom w:val="single" w:sz="6" w:space="0" w:color="auto"/>
+              <w:right w:val="single" w:sz="6" w:space="0" w:color="auto"/>
+            </w:tcBorders>
+            <w:tcMar>
+              <w:top w:w="240" w:type="dxa"/>
+              <w:left w:w="0" w:type="dxa"/>
+              <w:bottom w:w="240" w:type="dxa"/>
+              <w:right w:w="180" w:type="dxa"/>
+            </w:tcMar>
+            <w:vAlign w:val="center"/>
+            <w:hideMark/>
+          </w:tcPr>
+          <w:p>
+            <w:pPr>
+              <w:tabs>
+                <w:tab w:val="left" w:pos="4896"/>
+              </w:tabs>
+              <w:spacing w:line="240" w:lineRule="auto"/>
+              <w:jc w:val="center"/>
+              <w:rPr>
+                <w:rFonts w:ascii="Times New Roman" w:hAnsi="Times New Roman" w:cs="Times New Roman"/>
+              </w:rPr>
+            </w:pPr>
+            <w:proofErr w:type="spellStart"/>
+            <w:r>
+              <w:rPr>
+                <w:rFonts w:ascii="Times New Roman" w:hAnsi="Times New Roman" w:cs="Times New Roman"/>
+              </w:rPr>
+              <w:t>accion_recomendada</w:t>
+            </w:r>
+            <w:proofErr w:type="spellEnd"/>
+          </w:p>
+        </w:tc>
+        <w:tc>
+          <w:tcPr>
+            <w:tcW w:w="0" w:type="auto"/>
+            <w:tcBorders>
+              <w:top w:val="single" w:sz="6" w:space="0" w:color="auto"/>
+              <w:left w:val="single" w:sz="6" w:space="0" w:color="auto"/>
+              <w:bottom w:val="single" w:sz="6" w:space="0" w:color="auto"/>
+              <w:right w:val="single" w:sz="6" w:space="0" w:color="auto"/>
+            </w:tcBorders>
+            <w:tcMar>
+              <w:top w:w="240" w:type="dxa"/>
+              <w:left w:w="0" w:type="dxa"/>
+              <w:bottom w:w="240" w:type="dxa"/>
+              <w:right w:w="180" w:type="dxa"/>
+            </w:tcMar>
+            <w:vAlign w:val="center"/>
+            <w:hideMark/>
+          </w:tcPr>
+          <w:p>
+            <w:pPr>
+              <w:tabs>
+                <w:tab w:val="left" w:pos="4896"/>
+              </w:tabs>
+              <w:spacing w:line="240" w:lineRule="auto"/>
+              <w:jc w:val="center"/>
+              <w:rPr>
+                <w:rFonts w:ascii="Times New Roman" w:hAnsi="Times New Roman" w:cs="Times New Roman"/>
+              </w:rPr>
+            </w:pPr>
+            <w:r>
+              <w:rPr>
+                <w:rFonts w:ascii="Times New Roman" w:hAnsi="Times New Roman" w:cs="Times New Roman"/>
+              </w:rPr>
+              <w:t>Texto (</w:t>
+            </w:r>
+            <w:proofErr w:type="spellStart"/>
+            <w:r>
+              <w:rPr>
+                <w:rFonts w:ascii="Times New Roman" w:hAnsi="Times New Roman" w:cs="Times New Roman"/>
+              </w:rPr>
+              <w:t>str</w:t>
+            </w:r>
+            <w:proofErr w:type="spellEnd"/>
+            <w:r>
+              <w:rPr>
+                <w:rFonts w:ascii="Times New Roman" w:hAnsi="Times New Roman" w:cs="Times New Roman"/>
+              </w:rPr>
+              <w:t>)</w:t>
+            </w:r>
+          </w:p>
+        </w:tc>
+        <w:tc>
+          <w:tcPr>
+            <w:tcW w:w="0" w:type="auto"/>
+            <w:tcBorders>
+              <w:top w:val="single" w:sz="6" w:space="0" w:color="auto"/>
+              <w:left w:val="single" w:sz="6" w:space="0" w:color="auto"/>
+              <w:bottom w:val="single" w:sz="6" w:space="0" w:color="auto"/>
+              <w:right w:val="single" w:sz="6" w:space="0" w:color="auto"/>
+            </w:tcBorders>
+            <w:tcMar>
+              <w:top w:w="240" w:type="dxa"/>
+              <w:left w:w="0" w:type="dxa"/>
+              <w:bottom w:w="240" w:type="dxa"/>
+              <w:right w:w="0" w:type="dxa"/>
+            </w:tcMar>
+            <w:vAlign w:val="center"/>
+            <w:hideMark/>
+          </w:tcPr>
+          <w:p>
+            <w:pPr>
+              <w:tabs>
+                <w:tab w:val="left" w:pos="4896"/>
+              </w:tabs>
+              <w:spacing w:line="240" w:lineRule="auto"/>
+              <w:jc w:val="center"/>
+              <w:rPr>
+                <w:rFonts w:ascii="Times New Roman" w:hAnsi="Times New Roman" w:cs="Times New Roman"/>
+              </w:rPr>
+            </w:pPr>
+            <w:r>
+              <w:rPr>
+                <w:rFonts w:ascii="Times New Roman" w:hAnsi="Times New Roman" w:cs="Times New Roman"/>
+              </w:rPr>
+              <w:t>"Enviar técnico", "Notificación preventiva" o "Sin acción".</w:t>
+            </w:r>
+          </w:p>
+        </w:tc>
+      </w:tr>
+      <w:tr>
+        <w:trPr>
+          <w:tblCellSpacing w:w="15" w:type="dxa"/>
+          <w:jc w:val="center"/>
+        </w:trPr>
+        <w:tc>
+          <w:tcPr>
+            <w:tcW w:w="0" w:type="auto"/>
+            <w:tcBorders>
+              <w:top w:val="single" w:sz="6" w:space="0" w:color="auto"/>
+              <w:left w:val="single" w:sz="6" w:space="0" w:color="auto"/>
+              <w:bottom w:val="single" w:sz="6" w:space="0" w:color="auto"/>
+              <w:right w:val="single" w:sz="6" w:space="0" w:color="auto"/>
+            </w:tcBorders>
+            <w:tcMar>
+              <w:top w:w="240" w:type="dxa"/>
+              <w:left w:w="0" w:type="dxa"/>
+              <w:bottom w:w="240" w:type="dxa"/>
+              <w:right w:w="180" w:type="dxa"/>
+            </w:tcMar>
+            <w:vAlign w:val="center"/>
+            <w:hideMark/>
+          </w:tcPr>
+          <w:p>
+            <w:pPr>
+              <w:tabs>
+                <w:tab w:val="left" w:pos="4896"/>
+              </w:tabs>
+              <w:spacing w:line="240" w:lineRule="auto"/>
+              <w:jc w:val="center"/>
+              <w:rPr>
+                <w:rFonts w:ascii="Times New Roman" w:hAnsi="Times New Roman" w:cs="Times New Roman"/>
+              </w:rPr>
+            </w:pPr>
+            <w:proofErr w:type="spellStart"/>
+            <w:r>
+              <w:rPr>
+                <w:rFonts w:ascii="Times New Roman" w:hAnsi="Times New Roman" w:cs="Times New Roman"/>
+              </w:rPr>
+              <w:t>total_pagar</w:t>
+            </w:r>
+            <w:proofErr w:type="spellEnd"/>
+          </w:p>
+        </w:tc>
+        <w:tc>
+          <w:tcPr>
+            <w:tcW w:w="0" w:type="auto"/>
+            <w:tcBorders>
+              <w:top w:val="single" w:sz="6" w:space="0" w:color="auto"/>
+              <w:left w:val="single" w:sz="6" w:space="0" w:color="auto"/>
+              <w:bottom w:val="single" w:sz="6" w:space="0" w:color="auto"/>
+              <w:right w:val="single" w:sz="6" w:space="0" w:color="auto"/>
+            </w:tcBorders>
+            <w:tcMar>
+              <w:top w:w="240" w:type="dxa"/>
+              <w:left w:w="0" w:type="dxa"/>
+              <w:bottom w:w="240" w:type="dxa"/>
+              <w:right w:w="180" w:type="dxa"/>
+            </w:tcMar>
+            <w:vAlign w:val="center"/>
+            <w:hideMark/>
+          </w:tcPr>
+          <w:p>
+            <w:pPr>
+              <w:tabs>
+                <w:tab w:val="left" w:pos="4896"/>
+              </w:tabs>
+              <w:spacing w:line="240" w:lineRule="auto"/>
+              <w:jc w:val="center"/>
+              <w:rPr>
+                <w:rFonts w:ascii="Times New Roman" w:hAnsi="Times New Roman" w:cs="Times New Roman"/>
+              </w:rPr>
+            </w:pPr>
+            <w:r>
+              <w:rPr>
+                <w:rFonts w:ascii="Times New Roman" w:hAnsi="Times New Roman" w:cs="Times New Roman"/>
+              </w:rPr>
+              <w:t>Decimal (</w:t>
+            </w:r>
+            <w:proofErr w:type="spellStart"/>
+            <w:r>
+              <w:rPr>
+                <w:rFonts w:ascii="Times New Roman" w:hAnsi="Times New Roman" w:cs="Times New Roman"/>
+              </w:rPr>
+              <w:t>float</w:t>
+            </w:r>
+            <w:proofErr w:type="spellEnd"/>
+            <w:r>
+              <w:rPr>
+                <w:rFonts w:ascii="Times New Roman" w:hAnsi="Times New Roman" w:cs="Times New Roman"/>
+              </w:rPr>
+              <w:t>)</w:t>
+            </w:r>
+          </w:p>
+        </w:tc>
+        <w:tc>
+          <w:tcPr>
+            <w:tcW w:w="0" w:type="auto"/>
+            <w:tcBorders>
+              <w:top w:val="single" w:sz="6" w:space="0" w:color="auto"/>
+              <w:left w:val="single" w:sz="6" w:space="0" w:color="auto"/>
+              <w:bottom w:val="single" w:sz="6" w:space="0" w:color="auto"/>
+              <w:right w:val="single" w:sz="6" w:space="0" w:color="auto"/>
+            </w:tcBorders>
+            <w:tcMar>
+              <w:top w:w="240" w:type="dxa"/>
+              <w:left w:w="0" w:type="dxa"/>
+              <w:bottom w:w="240" w:type="dxa"/>
+              <w:right w:w="0" w:type="dxa"/>
+            </w:tcMar>
+            <w:vAlign w:val="center"/>
+            <w:hideMark/>
+          </w:tcPr>
+          <w:p>
+            <w:pPr>
+              <w:tabs>
+                <w:tab w:val="left" w:pos="4896"/>
+              </w:tabs>
+              <w:spacing w:line="240" w:lineRule="auto"/>
+              <w:jc w:val="center"/>
+              <w:rPr>
+                <w:rFonts w:ascii="Times New Roman" w:hAnsi="Times New Roman" w:cs="Times New Roman"/>
+              </w:rPr>
+            </w:pPr>
+            <w:r>
+              <w:rPr>
+                <w:rFonts w:ascii="Times New Roman" w:hAnsi="Times New Roman" w:cs="Times New Roman"/>
+              </w:rPr>
+              <w:t>Valor final tras aplicar subsidios y sumar excedentes.</w:t>
+            </w:r>
+          </w:p>
+        </w:tc>
+      </w:tr>
+      <w:tr>
+        <w:trPr>
+          <w:tblCellSpacing w:w="15" w:type="dxa"/>
+          <w:jc w:val="center"/>
+        </w:trPr>
+        <w:tc>
+          <w:tcPr>
+            <w:tcW w:w="0" w:type="auto"/>
+            <w:tcBorders>
+              <w:top w:val="single" w:sz="6" w:space="0" w:color="auto"/>
+              <w:left w:val="single" w:sz="6" w:space="0" w:color="auto"/>
+              <w:bottom w:val="single" w:sz="6" w:space="0" w:color="auto"/>
+              <w:right w:val="single" w:sz="6" w:space="0" w:color="auto"/>
+            </w:tcBorders>
+            <w:tcMar>
+              <w:top w:w="240" w:type="dxa"/>
+              <w:left w:w="0" w:type="dxa"/>
+              <w:bottom w:w="240" w:type="dxa"/>
+              <w:right w:w="180" w:type="dxa"/>
+            </w:tcMar>
+            <w:vAlign w:val="center"/>
+            <w:hideMark/>
+          </w:tcPr>
+          <w:p>
+            <w:pPr>
+              <w:tabs>
+                <w:tab w:val="left" w:pos="4896"/>
+              </w:tabs>
+              <w:spacing w:line="240" w:lineRule="auto"/>
+              <w:jc w:val="center"/>
+              <w:rPr>
+                <w:rFonts w:ascii="Times New Roman" w:hAnsi="Times New Roman" w:cs="Times New Roman"/>
+              </w:rPr>
+            </w:pPr>
+            <w:proofErr w:type="spellStart"/>
+            <w:r>
+              <w:rPr>
+                <w:rFonts w:ascii="Times New Roman" w:hAnsi="Times New Roman" w:cs="Times New Roman"/>
+              </w:rPr>
+              <w:t>registro_historico</w:t>
+            </w:r>
+            <w:proofErr w:type="spellEnd"/>
+          </w:p>
+        </w:tc>
+        <w:tc>
+          <w:tcPr>
+            <w:tcW w:w="0" w:type="auto"/>
+            <w:tcBorders>
+              <w:top w:val="single" w:sz="6" w:space="0" w:color="auto"/>
+              <w:left w:val="single" w:sz="6" w:space="0" w:color="auto"/>
+              <w:bottom w:val="single" w:sz="6" w:space="0" w:color="auto"/>
+              <w:right w:val="single" w:sz="6" w:space="0" w:color="auto"/>
+            </w:tcBorders>
+            <w:tcMar>
+              <w:top w:w="240" w:type="dxa"/>
+              <w:left w:w="0" w:type="dxa"/>
+              <w:bottom w:w="240" w:type="dxa"/>
+              <w:right w:w="180" w:type="dxa"/>
+            </w:tcMar>
+            <w:vAlign w:val="center"/>
+            <w:hideMark/>
+          </w:tcPr>
+          <w:p>
+            <w:pPr>
+              <w:tabs>
+                <w:tab w:val="left" w:pos="4896"/>
+              </w:tabs>
+              <w:spacing w:line="240" w:lineRule="auto"/>
+              <w:jc w:val="center"/>
+              <w:rPr>
+                <w:rFonts w:ascii="Times New Roman" w:hAnsi="Times New Roman" w:cs="Times New Roman"/>
+              </w:rPr>
+            </w:pPr>
+            <w:r>
+              <w:rPr>
+                <w:rFonts w:ascii="Times New Roman" w:hAnsi="Times New Roman" w:cs="Times New Roman"/>
+              </w:rPr>
+              <w:t>Fecha/Hora</w:t>
+            </w:r>
+          </w:p>
+        </w:tc>
+        <w:tc>
+          <w:tcPr>
+            <w:tcW w:w="0" w:type="auto"/>
+            <w:tcBorders>
+              <w:top w:val="single" w:sz="6" w:space="0" w:color="auto"/>
+              <w:left w:val="single" w:sz="6" w:space="0" w:color="auto"/>
+              <w:bottom w:val="single" w:sz="6" w:space="0" w:color="auto"/>
+              <w:right w:val="single" w:sz="6" w:space="0" w:color="auto"/>
+            </w:tcBorders>
+            <w:tcMar>
+              <w:top w:w="240" w:type="dxa"/>
+              <w:left w:w="0" w:type="dxa"/>
+              <w:bottom w:w="240" w:type="dxa"/>
+              <w:right w:w="0" w:type="dxa"/>
+            </w:tcMar>
+            <w:vAlign w:val="center"/>
+            <w:hideMark/>
+          </w:tcPr>
+          <w:p>
+            <w:pPr>
+              <w:tabs>
+                <w:tab w:val="left" w:pos="4896"/>
+              </w:tabs>
+              <w:spacing w:line="240" w:lineRule="auto"/>
+              <w:jc w:val="center"/>
+              <w:rPr>
+                <w:rFonts w:ascii="Times New Roman" w:hAnsi="Times New Roman" w:cs="Times New Roman"/>
+              </w:rPr>
+            </w:pPr>
+            <w:r>
+              <w:rPr>
+                <w:rFonts w:ascii="Times New Roman" w:hAnsi="Times New Roman" w:cs="Times New Roman"/>
+              </w:rPr>
+              <w:t>Almacena el momento exacto en que se generó la alerta.</w:t>
+            </w:r>
+          </w:p>
+        </w:tc>
+      </w:tr>
+    </w:tbl>
+    <w:p>
+      <w:pPr>
+        <w:tabs>
+          <w:tab w:val="left" w:pos="4896"/>
+        </w:tabs>
+        <w:jc w:val="center"/>
+        <w:rPr>
+          <w:rFonts w:ascii="Times New Roman" w:hAnsi="Times New Roman" w:cs="Times New Roman"/>
+        </w:rPr>
+      </w:pPr>
+    </w:p>
+    <w:p>
+      <w:pPr>
+        <w:tabs>
+          <w:tab w:val="left" w:pos="4896"/>
+        </w:tabs>
+        <w:jc w:val="center"/>
+        <w:rPr>
+          <w:rFonts w:ascii="Times New Roman" w:hAnsi="Times New Roman" w:cs="Times New Roman"/>
+        </w:rPr>
+      </w:pPr>
+    </w:p>
+    <w:p>
+      <w:pPr>
+        <w:tabs>
+          <w:tab w:val="left" w:pos="4896"/>
+        </w:tabs>
+        <w:jc w:val="center"/>
+        <w:rPr>
+          <w:rFonts w:ascii="Times New Roman" w:hAnsi="Times New Roman" w:cs="Times New Roman"/>
+        </w:rPr>
+      </w:pPr>
+    </w:p>
+    <w:p>
+      <w:pPr>
+        <w:tabs>
+          <w:tab w:val="left" w:pos="4896"/>
+        </w:tabs>
+        <w:jc w:val="center"/>
+        <w:rPr>
+          <w:rFonts w:ascii="Times New Roman" w:hAnsi="Times New Roman" w:cs="Times New Roman"/>
+        </w:rPr>
+      </w:pPr>
+    </w:p>
+    <w:p>
+      <w:pPr>
+        <w:tabs>
+          <w:tab w:val="left" w:pos="4896"/>
+        </w:tabs>
+        <w:jc w:val="center"/>
+        <w:rPr>
+          <w:rFonts w:ascii="Times New Roman" w:hAnsi="Times New Roman" w:cs="Times New Roman"/>
+        </w:rPr>
+      </w:pPr>
+    </w:p>
+    <w:p>
+      <w:pPr>
+        <w:tabs>
+          <w:tab w:val="left" w:pos="4896"/>
+        </w:tabs>
+        <w:jc w:val="center"/>
+        <w:rPr>
+          <w:rFonts w:ascii="Times New Roman" w:hAnsi="Times New Roman" w:cs="Times New Roman"/>
+        </w:rPr>
+      </w:pPr>
+    </w:p>
+    <w:p>
+      <w:pPr>
+        <w:tabs>
+          <w:tab w:val="left" w:pos="4896"/>
+        </w:tabs>
+        <w:jc w:val="center"/>
+        <w:rPr>
+          <w:rFonts w:ascii="Times New Roman" w:hAnsi="Times New Roman" w:cs="Times New Roman"/>
+        </w:rPr>
+      </w:pPr>
+    </w:p>
+    <w:p>
+      <w:pPr>
+        <w:tabs>
+          <w:tab w:val="left" w:pos="4896"/>
+        </w:tabs>
+        <w:jc w:val="center"/>
+        <w:rPr>
+          <w:rFonts w:ascii="Times New Roman" w:hAnsi="Times New Roman" w:cs="Times New Roman"/>
+        </w:rPr>
+      </w:pPr>
+    </w:p>
+    <w:p>
+      <w:pPr>
+        <w:tabs>
+          <w:tab w:val="left" w:pos="4896"/>
+        </w:tabs>
+        <w:jc w:val="center"/>
+        <w:rPr>
+          <w:rFonts w:ascii="Times New Roman" w:hAnsi="Times New Roman" w:cs="Times New Roman"/>
+        </w:rPr>
+      </w:pPr>
+    </w:p>
+    <w:p>
+      <w:pPr>
+        <w:tabs>
+          <w:tab w:val="left" w:pos="4896"/>
+        </w:tabs>
+        <w:jc w:val="center"/>
+        <w:rPr>
+          <w:rFonts w:ascii="Times New Roman" w:hAnsi="Times New Roman" w:cs="Times New Roman"/>
+        </w:rPr>
+      </w:pPr>
+    </w:p>
+    <w:p>
+      <w:pPr>
+        <w:tabs>
+          <w:tab w:val="left" w:pos="4896"/>
+        </w:tabs>
+        <w:jc w:val="center"/>
+        <w:rPr>
+          <w:rFonts w:ascii="Times New Roman" w:hAnsi="Times New Roman" w:cs="Times New Roman"/>
+        </w:rPr>
+      </w:pPr>
+    </w:p>
+    <w:p>
+      <w:pPr>
+        <w:tabs>
+          <w:tab w:val="left" w:pos="4896"/>
+        </w:tabs>
+        <w:jc w:val="center"/>
+        <w:rPr>
+          <w:rFonts w:ascii="Times New Roman" w:hAnsi="Times New Roman" w:cs="Times New Roman"/>
+        </w:rPr>
+      </w:pPr>
+    </w:p>
+    <w:p>
+      <w:pPr>
+        <w:tabs>
+          <w:tab w:val="left" w:pos="4896"/>
+        </w:tabs>
+        <w:jc w:val="center"/>
+        <w:rPr>
+          <w:rFonts w:ascii="Times New Roman" w:hAnsi="Times New Roman" w:cs="Times New Roman"/>
+        </w:rPr>
+      </w:pPr>
+    </w:p>
+    <w:p>
+      <w:pPr>
+        <w:tabs>
+          <w:tab w:val="left" w:pos="4896"/>
+        </w:tabs>
+        <w:jc w:val="center"/>
+        <w:rPr>
+          <w:rFonts w:ascii="Algerian" w:hAnsi="Algerian" w:cs="Times New Roman"/>
+          <w:b/>
+          <w:bCs/>
+          <w:sz w:val="40"/>
+          <w:szCs w:val="40"/>
+        </w:rPr>
+      </w:pPr>
+      <w:r>
+        <w:rPr>
+          <w:rFonts w:ascii="Algerian" w:hAnsi="Algerian" w:cs="Times New Roman"/>
+          <w:b/>
+          <w:bCs/>
+          <w:sz w:val="40"/>
+          <w:szCs w:val="40"/>
+        </w:rPr>
+        <w:t>Conclusión.</w:t>
+      </w:r>
+    </w:p>
+    <w:p>
+      <w:pPr>
+        <w:tabs>
+          <w:tab w:val="left" w:pos="4896"/>
+        </w:tabs>
+        <w:jc w:val="center"/>
+        <w:rPr>
+          <w:rFonts w:ascii="Times New Roman" w:hAnsi="Times New Roman" w:cs="Times New Roman"/>
+        </w:rPr>
+      </w:pPr>
+      <w:r>
+        <w:rPr>
+          <w:rFonts w:ascii="Times New Roman" w:hAnsi="Times New Roman" w:cs="Times New Roman"/>
+        </w:rPr>
+        <w:t xml:space="preserve">El desarrollo del </w:t>
+      </w:r>
+      <w:r>
+        <w:rPr>
+          <w:rFonts w:ascii="Times New Roman" w:hAnsi="Times New Roman" w:cs="Times New Roman"/>
+          <w:b/>
+          <w:bCs/>
+        </w:rPr>
+        <w:t>Software de Gestión de Consumo Energético para Soacha</w:t>
+      </w:r>
+      <w:r>
+        <w:rPr>
+          <w:rFonts w:ascii="Times New Roman" w:hAnsi="Times New Roman" w:cs="Times New Roman"/>
+        </w:rPr>
+        <w:t xml:space="preserve"> representa una solución tecnológica integral que transforma un proceso manual e ineficiente en un sistema de auditoría automatizado y confiable. A través de la implementación de este proyecto, se han alcanzado las siguientes determinaciones clave:</w:t>
+      </w:r>
+    </w:p>
+    <w:p>
+      <w:pPr>
+        <w:numPr>
+          <w:ilvl w:val="0"/>
+          <w:numId w:val="6"/>
+        </w:numPr>
+        <w:tabs>
+          <w:tab w:val="left" w:pos="4896"/>
+        </w:tabs>
+        <w:jc w:val="center"/>
+        <w:rPr>
+          <w:rFonts w:ascii="Times New Roman" w:hAnsi="Times New Roman" w:cs="Times New Roman"/>
+        </w:rPr>
+      </w:pPr>
+      <w:r>
+        <w:rPr>
+          <w:rFonts w:ascii="Times New Roman" w:hAnsi="Times New Roman" w:cs="Times New Roman"/>
+          <w:b/>
+          <w:bCs/>
+        </w:rPr>
+        <w:t>Optimización de la Supervisión Técnica:</w:t>
+      </w:r>
+      <w:r>
+        <w:rPr>
+          <w:rFonts w:ascii="Times New Roman" w:hAnsi="Times New Roman" w:cs="Times New Roman"/>
+        </w:rPr>
+        <w:t xml:space="preserve"> Al integrar un sistema de alertas basado en rangos específicos, la empresa ahora puede identificar automáticamente posibles fraudes (consumos &lt; 100 kWh) o fallas críticas en la instalación (&gt; 300 kWh). Esto permite que el personal técnico de Codensa actúe de manera dirigida, reduciendo costos operativos y mejorando el tiempo de respuesta ante irregularidades.</w:t>
+      </w:r>
+    </w:p>
+    <w:p>
+      <w:pPr>
+        <w:numPr>
+          <w:ilvl w:val="0"/>
+          <w:numId w:val="6"/>
+        </w:numPr>
+        <w:tabs>
+          <w:tab w:val="left" w:pos="4896"/>
+        </w:tabs>
+        <w:jc w:val="center"/>
+        <w:rPr>
+          <w:rFonts w:ascii="Times New Roman" w:hAnsi="Times New Roman" w:cs="Times New Roman"/>
+        </w:rPr>
+      </w:pPr>
+      <w:r>
+        <w:rPr>
+          <w:rFonts w:ascii="Times New Roman" w:hAnsi="Times New Roman" w:cs="Times New Roman"/>
+          <w:b/>
+          <w:bCs/>
+        </w:rPr>
+        <w:t>Precisión en el Beneficio Social:</w:t>
+      </w:r>
+      <w:r>
+        <w:rPr>
+          <w:rFonts w:ascii="Times New Roman" w:hAnsi="Times New Roman" w:cs="Times New Roman"/>
+        </w:rPr>
+        <w:t xml:space="preserve"> El software garantiza que los subsidios gubernamentales del 60%, 50% y 15% para los estratos 1, 2 y 3 se apliquen con total exactitud sobre el límite de subsistencia de 130 kWh, tal como lo exige la normativa vigente en el municipio. Esto asegura una facturación justa y transparente para los hogares de Soacha.</w:t>
+      </w:r>
+    </w:p>
+    <w:p>
+      <w:pPr>
+        <w:numPr>
+          <w:ilvl w:val="0"/>
+          <w:numId w:val="6"/>
+        </w:numPr>
+        <w:tabs>
+          <w:tab w:val="left" w:pos="4896"/>
+        </w:tabs>
+        <w:jc w:val="center"/>
+        <w:rPr>
+          <w:rFonts w:ascii="Times New Roman" w:hAnsi="Times New Roman" w:cs="Times New Roman"/>
+        </w:rPr>
+      </w:pPr>
+      <w:r>
+        <w:rPr>
+          <w:rFonts w:ascii="Times New Roman" w:hAnsi="Times New Roman" w:cs="Times New Roman"/>
+          <w:b/>
+          <w:bCs/>
+        </w:rPr>
+        <w:t>Arquitectura de Datos Robusta:</w:t>
+      </w:r>
+      <w:r>
+        <w:rPr>
+          <w:rFonts w:ascii="Times New Roman" w:hAnsi="Times New Roman" w:cs="Times New Roman"/>
+        </w:rPr>
+        <w:t xml:space="preserve"> Gracias al diseño del </w:t>
+      </w:r>
+      <w:r>
+        <w:rPr>
+          <w:rFonts w:ascii="Times New Roman" w:hAnsi="Times New Roman" w:cs="Times New Roman"/>
+          <w:b/>
+          <w:bCs/>
+        </w:rPr>
+        <w:t>Modelo Entidad-Relación (MER)</w:t>
+      </w:r>
+      <w:r>
+        <w:rPr>
+          <w:rFonts w:ascii="Times New Roman" w:hAnsi="Times New Roman" w:cs="Times New Roman"/>
+        </w:rPr>
+        <w:t>, la información se encuentra normalizada y relacionada mediante llaves (PK y FK), lo que garantiza la integridad de los datos. El sistema vincula de forma coherente al técnico (Empleado), la vivienda (Hogar) y el registro (Lectura), permitiendo un seguimiento histórico detallado para futuras auditorías.</w:t>
+      </w:r>
+    </w:p>
+    <w:p>
+      <w:pPr>
+        <w:tabs>
+          <w:tab w:val="left" w:pos="4896"/>
+        </w:tabs>
+        <w:jc w:val="center"/>
+        <w:rPr>
+          <w:rFonts w:ascii="Times New Roman" w:hAnsi="Times New Roman" w:cs="Times New Roman"/>
+        </w:rPr>
+      </w:pPr>
+      <w:r>
+        <w:rPr>
+          <w:rFonts w:ascii="Times New Roman" w:hAnsi="Times New Roman" w:cs="Times New Roman"/>
+        </w:rPr>
+        <w:t>En conclusión, este software no solo cumple con los objetivos técnicos propuestos, sino que se posiciona como una herramienta estratégica para garantizar el uso eficiente de la energía y la correcta administración de los recursos públicos en el sector eléctrico.</w:t>
+      </w:r>
+    </w:p>
+    <w:p>
+      <w:pPr>
+        <w:tabs>
+          <w:tab w:val="left" w:pos="4896"/>
+        </w:tabs>
+        <w:jc w:val="center"/>
+        <w:rPr>
+          <w:rFonts w:ascii="Times New Roman" w:hAnsi="Times New Roman" w:cs="Times New Roman"/>
+        </w:rPr>
+      </w:pPr>
+    </w:p>
+    <w:p>
+      <w:pPr>
+        <w:tabs>
+          <w:tab w:val="left" w:pos="4896"/>
+        </w:tabs>
+        <w:jc w:val="center"/>
+        <w:rPr>
+          <w:rFonts w:ascii="Times New Roman" w:hAnsi="Times New Roman" w:cs="Times New Roman"/>
+        </w:rPr>
+      </w:pPr>
+    </w:p>
+    <w:p>
+      <w:pPr>
+        <w:tabs>
+          <w:tab w:val="left" w:pos="4896"/>
+        </w:tabs>
+        <w:jc w:val="center"/>
+        <w:rPr>
+          <w:rFonts w:ascii="Times New Roman" w:hAnsi="Times New Roman" w:cs="Times New Roman"/>
+        </w:rPr>
+      </w:pPr>
+    </w:p>
+    <w:p>
+      <w:pPr>
+        <w:tabs>
+          <w:tab w:val="left" w:pos="4896"/>
+        </w:tabs>
+        <w:jc w:val="center"/>
+        <w:rPr>
+          <w:rFonts w:ascii="Times New Roman" w:hAnsi="Times New Roman" w:cs="Times New Roman"/>
+        </w:rPr>
+      </w:pPr>
+    </w:p>
+    <w:p>
+      <w:pPr>
+        <w:tabs>
+          <w:tab w:val="left" w:pos="4896"/>
+        </w:tabs>
+        <w:jc w:val="center"/>
+        <w:rPr>
+          <w:rFonts w:ascii="Times New Roman" w:hAnsi="Times New Roman" w:cs="Times New Roman"/>
+        </w:rPr>
+      </w:pPr>
+    </w:p>
+    <w:p>
+      <w:pPr>
+        <w:tabs>
+          <w:tab w:val="left" w:pos="4896"/>
+        </w:tabs>
+        <w:jc w:val="center"/>
+        <w:rPr>
+          <w:rFonts w:ascii="Times New Roman" w:hAnsi="Times New Roman" w:cs="Times New Roman"/>
+        </w:rPr>
+      </w:pPr>
+    </w:p>
+    <w:p>
+      <w:pPr>
+        <w:tabs>
+          <w:tab w:val="left" w:pos="4896"/>
+        </w:tabs>
+        <w:jc w:val="center"/>
+        <w:rPr>
+          <w:rFonts w:ascii="Times New Roman" w:hAnsi="Times New Roman" w:cs="Times New Roman"/>
+        </w:rPr>
+      </w:pPr>
+    </w:p>
+    <w:p>
+      <w:pPr>
+        <w:tabs>
+          <w:tab w:val="left" w:pos="4896"/>
+        </w:tabs>
+        <w:jc w:val="center"/>
+        <w:rPr>
+          <w:rFonts w:ascii="Times New Roman" w:hAnsi="Times New Roman" w:cs="Times New Roman"/>
+        </w:rPr>
+      </w:pPr>
+    </w:p>
+    <w:p>
+      <w:pPr>
+        <w:tabs>
+          <w:tab w:val="left" w:pos="4896"/>
+        </w:tabs>
+        <w:jc w:val="center"/>
+        <w:rPr>
+          <w:rFonts w:ascii="Times New Roman" w:hAnsi="Times New Roman" w:cs="Times New Roman"/>
+        </w:rPr>
+      </w:pPr>
+    </w:p>
+    <w:p>
+      <w:pPr>
+        <w:tabs>
+          <w:tab w:val="left" w:pos="4896"/>
+        </w:tabs>
+        <w:jc w:val="center"/>
+        <w:rPr>
+          <w:rFonts w:ascii="Times New Roman" w:hAnsi="Times New Roman" w:cs="Times New Roman"/>
+        </w:rPr>
+      </w:pPr>
+    </w:p>
+    <w:p>
+      <w:pPr>
+        <w:tabs>
+          <w:tab w:val="left" w:pos="4896"/>
+        </w:tabs>
+        <w:jc w:val="center"/>
+        <w:rPr>
+          <w:rFonts w:ascii="Times New Roman" w:hAnsi="Times New Roman" w:cs="Times New Roman"/>
+        </w:rPr>
+      </w:pPr>
+    </w:p>
+    <w:p>
+      <w:pPr>
+        <w:tabs>
+          <w:tab w:val="left" w:pos="4896"/>
+        </w:tabs>
+        <w:jc w:val="center"/>
+        <w:rPr>
+          <w:rFonts w:ascii="Times New Roman" w:hAnsi="Times New Roman" w:cs="Times New Roman"/>
+        </w:rPr>
+      </w:pPr>
+    </w:p>
+    <w:p>
+      <w:pPr>
+        <w:tabs>
+          <w:tab w:val="left" w:pos="4896"/>
+        </w:tabs>
+        <w:jc w:val="center"/>
+        <w:rPr>
+          <w:rFonts w:ascii="Times New Roman" w:hAnsi="Times New Roman" w:cs="Times New Roman"/>
+        </w:rPr>
+      </w:pPr>
+    </w:p>
+    <w:p>
+      <w:pPr>
+        <w:tabs>
+          <w:tab w:val="left" w:pos="4896"/>
+        </w:tabs>
+        <w:jc w:val="center"/>
+        <w:rPr>
+          <w:rFonts w:ascii="Times New Roman" w:hAnsi="Times New Roman" w:cs="Times New Roman"/>
+        </w:rPr>
+      </w:pPr>
+    </w:p>
+    <w:p>
+      <w:pPr>
+        <w:tabs>
+          <w:tab w:val="left" w:pos="4896"/>
+        </w:tabs>
+        <w:jc w:val="center"/>
+        <w:rPr>
+          <w:rFonts w:ascii="Times New Roman" w:hAnsi="Times New Roman" w:cs="Times New Roman"/>
+        </w:rPr>
+      </w:pPr>
+    </w:p>
+    <w:p>
+      <w:pPr>
+        <w:tabs>
+          <w:tab w:val="left" w:pos="4896"/>
+        </w:tabs>
+        <w:jc w:val="center"/>
+        <w:rPr>
+          <w:rFonts w:ascii="Times New Roman" w:hAnsi="Times New Roman" w:cs="Times New Roman"/>
+        </w:rPr>
+      </w:pPr>
+    </w:p>
+    <w:p>
+      <w:pPr>
+        <w:tabs>
+          <w:tab w:val="left" w:pos="4896"/>
+        </w:tabs>
+        <w:jc w:val="center"/>
+        <w:rPr>
+          <w:rFonts w:ascii="Times New Roman" w:hAnsi="Times New Roman" w:cs="Times New Roman"/>
+        </w:rPr>
+      </w:pPr>
+    </w:p>
+    <w:p>
+      <w:pPr>
+        <w:tabs>
+          <w:tab w:val="left" w:pos="4896"/>
+        </w:tabs>
+        <w:jc w:val="center"/>
+        <w:rPr>
+          <w:rFonts w:ascii="Algerian" w:hAnsi="Algerian" w:cs="Times New Roman"/>
+          <w:b/>
+          <w:bCs/>
+          <w:i/>
+          <w:iCs/>
+          <w:sz w:val="180"/>
+          <w:szCs w:val="180"/>
+        </w:rPr>
+      </w:pPr>
+      <w:r>
+        <w:rPr>
+          <w:rFonts w:ascii="Algerian" w:hAnsi="Algerian" w:cs="Times New Roman"/>
+          <w:b/>
+          <w:bCs/>
+          <w:i/>
+          <w:iCs/>
+          <w:sz w:val="180"/>
+          <w:szCs w:val="180"/>
+        </w:rPr>
+        <w:t>Gracias.</w:t>
+      </w:r>
+    </w:p>
+    <w:p>
+      <w:pPr>
+        <w:tabs>
+          <w:tab w:val="left" w:pos="4896"/>
+        </w:tabs>
+        <w:jc w:val="center"/>
+        <w:rPr>
+          <w:rFonts w:ascii="Times New Roman" w:hAnsi="Times New Roman" w:cs="Times New Roman"/>
+        </w:rPr>
+      </w:pPr>
     </w:p>
     <w:sectPr>
-      <w:headerReference w:type="default" r:id="rId8"/>
+      <w:headerReference w:type="default" r:id="rId10"/>
       <w:pgSz w:w="12240" w:h="15840"/>
       <w:pgMar w:top="1417" w:right="1701" w:bottom="1417" w:left="1701" w:header="708" w:footer="708" w:gutter="0"/>
       <w:cols w:space="708"/>
@@ -2986,9 +6350,9 @@
 <file path=word/numbering.xml><?xml version="1.0" encoding="utf-8"?>
 <w:numbering xmlns:wpc="http://schemas.microsoft.com/office/word/2010/wordprocessingCanvas" xmlns:cx="http://schemas.microsoft.com/office/drawing/2014/chartex" xmlns:cx1="http://schemas.microsoft.com/office/drawing/2015/9/8/chartex" xmlns:cx2="http://schemas.microsoft.com/office/drawing/2015/10/21/chartex" xmlns:cx3="http://schemas.microsoft.com/office/drawing/2016/5/9/chartex" xmlns:cx4="http://schemas.microsoft.com/office/drawing/2016/5/10/chartex" xmlns:cx5="http://schemas.microsoft.com/office/drawing/2016/5/11/chartex" xmlns:cx6="http://schemas.microsoft.com/office/drawing/2016/5/12/chartex" xmlns:cx7="http://schemas.microsoft.com/office/drawing/2016/5/13/chartex" xmlns:cx8="http://schemas.microsoft.com/office/drawing/2016/5/14/chartex" xmlns:mc="http://schemas.openxmlformats.org/markup-compatibility/2006" xmlns:aink="http://schemas.microsoft.com/office/drawing/2016/ink" xmlns:am3d="http://schemas.microsoft.com/office/drawing/2017/model3d" xmlns:o="urn:schemas-microsoft-com:office:office" xmlns:oel="http://schemas.microsoft.com/office/2019/extlst" xmlns:r="http://schemas.openxmlformats.org/officeDocument/2006/relationships" xmlns:m="http://schemas.openxmlformats.org/officeDocument/2006/math" xmlns:v="urn:schemas-microsoft-com:vml" xmlns:wp14="http://schemas.microsoft.com/office/word/2010/wordprocessingDrawing" xmlns:wp="http://schemas.openxmlformats.org/drawingml/2006/wordprocessingDrawing" xmlns:w10="urn:schemas-microsoft-com:office:word" xmlns:w="http://schemas.openxmlformats.org/wordprocessingml/2006/main" xmlns:w14="http://schemas.microsoft.com/office/word/2010/wordml" xmlns:w15="http://schemas.microsoft.com/office/word/2012/wordml" xmlns:w16cex="http://schemas.microsoft.com/office/word/2018/wordml/cex" xmlns:w16cid="http://schemas.microsoft.com/office/word/2016/wordml/cid" xmlns:w16="http://schemas.microsoft.com/office/word/2018/wordml" xmlns:w16du="http://schemas.microsoft.com/office/word/2023/wordml/word16du" xmlns:w16sdtdh="http://schemas.microsoft.com/office/word/2020/wordml/sdtdatahash" xmlns:w16sdtfl="http://schemas.microsoft.com/office/word/2024/wordml/sdtformatlock" xmlns:w16se="http://schemas.microsoft.com/office/word/2015/wordml/symex" xmlns:wpg="http://schemas.microsoft.com/office/word/2010/wordprocessingGroup" xmlns:wpi="http://schemas.microsoft.com/office/word/2010/wordprocessingInk" xmlns:wne="http://schemas.microsoft.com/office/word/2006/wordml" xmlns:wps="http://schemas.microsoft.com/office/word/2010/wordprocessingShape" mc:Ignorable="w14 w15 w16se w16cid w16 w16cex w16sdtdh w16sdtfl w16du wp14">
   <w:abstractNum w:abstractNumId="0" w15:restartNumberingAfterBreak="0">
-    <w:nsid w:val="1D2B408E"/>
+    <w:nsid w:val="060C1F4A"/>
     <w:multiLevelType w:val="multilevel"/>
-    <w:tmpl w:val="8CD67C2C"/>
+    <w:tmpl w:val="2D9ACD00"/>
     <w:lvl w:ilvl="0">
       <w:start w:val="1"/>
       <w:numFmt w:val="bullet"/>
@@ -3135,9 +6499,9 @@
     </w:lvl>
   </w:abstractNum>
   <w:abstractNum w:abstractNumId="1" w15:restartNumberingAfterBreak="0">
-    <w:nsid w:val="426B40C2"/>
+    <w:nsid w:val="1D2B408E"/>
     <w:multiLevelType w:val="multilevel"/>
-    <w:tmpl w:val="126C2DF0"/>
+    <w:tmpl w:val="8CD67C2C"/>
     <w:lvl w:ilvl="0">
       <w:start w:val="1"/>
       <w:numFmt w:val="bullet"/>
@@ -3284,6 +6648,155 @@
     </w:lvl>
   </w:abstractNum>
   <w:abstractNum w:abstractNumId="2" w15:restartNumberingAfterBreak="0">
+    <w:nsid w:val="426B40C2"/>
+    <w:multiLevelType w:val="multilevel"/>
+    <w:tmpl w:val="126C2DF0"/>
+    <w:lvl w:ilvl="0">
+      <w:start w:val="1"/>
+      <w:numFmt w:val="bullet"/>
+      <w:lvlText w:val=""/>
+      <w:lvlJc w:val="left"/>
+      <w:pPr>
+        <w:tabs>
+          <w:tab w:val="num" w:pos="720"/>
+        </w:tabs>
+        <w:ind w:left="720" w:hanging="360"/>
+      </w:pPr>
+      <w:rPr>
+        <w:rFonts w:ascii="Symbol" w:hAnsi="Symbol" w:hint="default"/>
+        <w:sz w:val="20"/>
+      </w:rPr>
+    </w:lvl>
+    <w:lvl w:ilvl="1" w:tentative="1">
+      <w:start w:val="1"/>
+      <w:numFmt w:val="bullet"/>
+      <w:lvlText w:val="o"/>
+      <w:lvlJc w:val="left"/>
+      <w:pPr>
+        <w:tabs>
+          <w:tab w:val="num" w:pos="1440"/>
+        </w:tabs>
+        <w:ind w:left="1440" w:hanging="360"/>
+      </w:pPr>
+      <w:rPr>
+        <w:rFonts w:ascii="Courier New" w:hAnsi="Courier New" w:hint="default"/>
+        <w:sz w:val="20"/>
+      </w:rPr>
+    </w:lvl>
+    <w:lvl w:ilvl="2" w:tentative="1">
+      <w:start w:val="1"/>
+      <w:numFmt w:val="bullet"/>
+      <w:lvlText w:val=""/>
+      <w:lvlJc w:val="left"/>
+      <w:pPr>
+        <w:tabs>
+          <w:tab w:val="num" w:pos="2160"/>
+        </w:tabs>
+        <w:ind w:left="2160" w:hanging="360"/>
+      </w:pPr>
+      <w:rPr>
+        <w:rFonts w:ascii="Wingdings" w:hAnsi="Wingdings" w:hint="default"/>
+        <w:sz w:val="20"/>
+      </w:rPr>
+    </w:lvl>
+    <w:lvl w:ilvl="3" w:tentative="1">
+      <w:start w:val="1"/>
+      <w:numFmt w:val="bullet"/>
+      <w:lvlText w:val=""/>
+      <w:lvlJc w:val="left"/>
+      <w:pPr>
+        <w:tabs>
+          <w:tab w:val="num" w:pos="2880"/>
+        </w:tabs>
+        <w:ind w:left="2880" w:hanging="360"/>
+      </w:pPr>
+      <w:rPr>
+        <w:rFonts w:ascii="Wingdings" w:hAnsi="Wingdings" w:hint="default"/>
+        <w:sz w:val="20"/>
+      </w:rPr>
+    </w:lvl>
+    <w:lvl w:ilvl="4" w:tentative="1">
+      <w:start w:val="1"/>
+      <w:numFmt w:val="bullet"/>
+      <w:lvlText w:val=""/>
+      <w:lvlJc w:val="left"/>
+      <w:pPr>
+        <w:tabs>
+          <w:tab w:val="num" w:pos="3600"/>
+        </w:tabs>
+        <w:ind w:left="3600" w:hanging="360"/>
+      </w:pPr>
+      <w:rPr>
+        <w:rFonts w:ascii="Wingdings" w:hAnsi="Wingdings" w:hint="default"/>
+        <w:sz w:val="20"/>
+      </w:rPr>
+    </w:lvl>
+    <w:lvl w:ilvl="5" w:tentative="1">
+      <w:start w:val="1"/>
+      <w:numFmt w:val="bullet"/>
+      <w:lvlText w:val=""/>
+      <w:lvlJc w:val="left"/>
+      <w:pPr>
+        <w:tabs>
+          <w:tab w:val="num" w:pos="4320"/>
+        </w:tabs>
+        <w:ind w:left="4320" w:hanging="360"/>
+      </w:pPr>
+      <w:rPr>
+        <w:rFonts w:ascii="Wingdings" w:hAnsi="Wingdings" w:hint="default"/>
+        <w:sz w:val="20"/>
+      </w:rPr>
+    </w:lvl>
+    <w:lvl w:ilvl="6" w:tentative="1">
+      <w:start w:val="1"/>
+      <w:numFmt w:val="bullet"/>
+      <w:lvlText w:val=""/>
+      <w:lvlJc w:val="left"/>
+      <w:pPr>
+        <w:tabs>
+          <w:tab w:val="num" w:pos="5040"/>
+        </w:tabs>
+        <w:ind w:left="5040" w:hanging="360"/>
+      </w:pPr>
+      <w:rPr>
+        <w:rFonts w:ascii="Wingdings" w:hAnsi="Wingdings" w:hint="default"/>
+        <w:sz w:val="20"/>
+      </w:rPr>
+    </w:lvl>
+    <w:lvl w:ilvl="7" w:tentative="1">
+      <w:start w:val="1"/>
+      <w:numFmt w:val="bullet"/>
+      <w:lvlText w:val=""/>
+      <w:lvlJc w:val="left"/>
+      <w:pPr>
+        <w:tabs>
+          <w:tab w:val="num" w:pos="5760"/>
+        </w:tabs>
+        <w:ind w:left="5760" w:hanging="360"/>
+      </w:pPr>
+      <w:rPr>
+        <w:rFonts w:ascii="Wingdings" w:hAnsi="Wingdings" w:hint="default"/>
+        <w:sz w:val="20"/>
+      </w:rPr>
+    </w:lvl>
+    <w:lvl w:ilvl="8" w:tentative="1">
+      <w:start w:val="1"/>
+      <w:numFmt w:val="bullet"/>
+      <w:lvlText w:val=""/>
+      <w:lvlJc w:val="left"/>
+      <w:pPr>
+        <w:tabs>
+          <w:tab w:val="num" w:pos="6480"/>
+        </w:tabs>
+        <w:ind w:left="6480" w:hanging="360"/>
+      </w:pPr>
+      <w:rPr>
+        <w:rFonts w:ascii="Wingdings" w:hAnsi="Wingdings" w:hint="default"/>
+        <w:sz w:val="20"/>
+      </w:rPr>
+    </w:lvl>
+  </w:abstractNum>
+  <w:abstractNum w:abstractNumId="3" w15:restartNumberingAfterBreak="0">
     <w:nsid w:val="5A0D69C1"/>
     <w:multiLevelType w:val="hybridMultilevel"/>
     <w:tmpl w:val="C3D0A5D8"/>
@@ -3396,7 +6909,7 @@
       </w:rPr>
     </w:lvl>
   </w:abstractNum>
-  <w:abstractNum w:abstractNumId="3" w15:restartNumberingAfterBreak="0">
+  <w:abstractNum w:abstractNumId="4" w15:restartNumberingAfterBreak="0">
     <w:nsid w:val="5BC67215"/>
     <w:multiLevelType w:val="multilevel"/>
     <w:tmpl w:val="B15A54CE"/>
@@ -3545,7 +7058,7 @@
       </w:rPr>
     </w:lvl>
   </w:abstractNum>
-  <w:abstractNum w:abstractNumId="4" w15:restartNumberingAfterBreak="0">
+  <w:abstractNum w:abstractNumId="5" w15:restartNumberingAfterBreak="0">
     <w:nsid w:val="6ECB1E31"/>
     <w:multiLevelType w:val="multilevel"/>
     <w:tmpl w:val="F168E0C4"/>
@@ -3663,19 +7176,22 @@
     </w:lvl>
   </w:abstractNum>
   <w:num w:numId="1" w16cid:durableId="882405956">
+    <w:abstractNumId w:val="3"/>
+  </w:num>
+  <w:num w:numId="2" w16cid:durableId="1818759797">
     <w:abstractNumId w:val="2"/>
   </w:num>
-  <w:num w:numId="2" w16cid:durableId="1818759797">
+  <w:num w:numId="3" w16cid:durableId="1062365910">
+    <w:abstractNumId w:val="5"/>
+  </w:num>
+  <w:num w:numId="4" w16cid:durableId="170226110">
     <w:abstractNumId w:val="1"/>
   </w:num>
-  <w:num w:numId="3" w16cid:durableId="1062365910">
+  <w:num w:numId="5" w16cid:durableId="1672904444">
     <w:abstractNumId w:val="4"/>
   </w:num>
-  <w:num w:numId="4" w16cid:durableId="170226110">
+  <w:num w:numId="6" w16cid:durableId="231743315">
     <w:abstractNumId w:val="0"/>
-  </w:num>
-  <w:num w:numId="5" w16cid:durableId="1672904444">
-    <w:abstractNumId w:val="3"/>
   </w:num>
 </w:numbering>
 </file>
@@ -4283,6 +7799,7 @@
   <w:style w:type="character" w:default="1" w:styleId="Fuentedeprrafopredeter">
     <w:name w:val="Default Paragraph Font"/>
     <w:uiPriority w:val="1"/>
+    <w:semiHidden/>
     <w:unhideWhenUsed/>
   </w:style>
   <w:style w:type="table" w:default="1" w:styleId="Tablanormal">

</xml_diff>